<commit_message>
feat: modernização do portfólio, atualização de dados e melhorias de usabilidade/responsividade
</commit_message>
<xml_diff>
--- a/public/cv-winston-almeida.docx
+++ b/public/cv-winston-almeida.docx
@@ -9,12 +9,88 @@
         <w:spacing w:lineRule="auto" w:line="276"/>
         <w:jc w:val="start"/>
         <w:rPr>
+          <w:lang w:val="pt-BR" w:eastAsia="zh-CN" w:bidi="hi-IN"/>
+        </w:rPr>
+      </w:pPr>
+      <w:r>
+        <w:rPr>
           <w:rFonts w:ascii="Times New Roman" w:hAnsi="Times New Roman"/>
           <w:b/>
           <w:bCs/>
           <w:color w:val="2A6099"/>
           <w:sz w:val="28"/>
           <w:szCs w:val="28"/>
+          <w:lang w:val="pt-BR" w:eastAsia="zh-CN" w:bidi="hi-IN"/>
+        </w:rPr>
+        <w:t>Winston Melo de Almeida Júnior</w:t>
+      </w:r>
+    </w:p>
+    <w:p>
+      <w:pPr>
+        <w:pStyle w:val="Normal"/>
+        <w:bidi w:val="0"/>
+        <w:spacing w:lineRule="auto" w:line="240"/>
+        <w:jc w:val="start"/>
+        <w:rPr>
+          <w:lang w:val="pt-BR"/>
+        </w:rPr>
+      </w:pPr>
+      <w:r>
+        <w:rPr>
+          <w:rFonts w:ascii="Times New Roman" w:hAnsi="Times New Roman"/>
+          <w:lang w:val="pt-BR"/>
+        </w:rPr>
+        <w:t xml:space="preserve">São Luís/MA | winston.almeidamjr@gmail.com | 98 9 9983-2637 | linkedin.com/in/winstonajr | github.com/winstonajr | </w:t>
+      </w:r>
+      <w:r>
+        <w:rPr>
+          <w:lang w:val="pt-BR"/>
+        </w:rPr>
+        <w:t>winstonajr.com.br</w:t>
+      </w:r>
+    </w:p>
+    <w:p>
+      <w:pPr>
+        <w:pStyle w:val="Normal"/>
+        <w:bidi w:val="0"/>
+        <w:jc w:val="start"/>
+        <w:rPr>
+          <w:rFonts w:ascii="Times New Roman" w:hAnsi="Times New Roman"/>
+          <w:lang w:val="pt-BR"/>
+        </w:rPr>
+      </w:pPr>
+      <w:r>
+        <w:rPr>
+          <w:rFonts w:ascii="Times New Roman" w:hAnsi="Times New Roman"/>
+          <w:lang w:val="pt-BR"/>
+        </w:rPr>
+      </w:r>
+    </w:p>
+    <w:p>
+      <w:pPr>
+        <w:pStyle w:val="Normal"/>
+        <w:bidi w:val="0"/>
+        <w:jc w:val="start"/>
+        <w:rPr>
+          <w:rFonts w:ascii="Times New Roman" w:hAnsi="Times New Roman"/>
+          <w:lang w:val="pt-BR"/>
+        </w:rPr>
+      </w:pPr>
+      <w:r>
+        <w:rPr>
+          <w:rFonts w:ascii="Times New Roman" w:hAnsi="Times New Roman"/>
+          <w:lang w:val="pt-BR"/>
+        </w:rPr>
+      </w:r>
+    </w:p>
+    <w:p>
+      <w:pPr>
+        <w:pStyle w:val="Normal"/>
+        <w:bidi w:val="0"/>
+        <w:spacing w:lineRule="auto" w:line="276"/>
+        <w:jc w:val="start"/>
+        <w:rPr>
+          <w:lang w:val="pt-BR"/>
         </w:rPr>
       </w:pPr>
       <w:r>
@@ -25,68 +101,299 @@
           <w:color w:val="2A6099"/>
           <w:sz w:val="28"/>
           <w:szCs w:val="28"/>
-        </w:rPr>
-        <w:t>Winston Melo de Almeida Júnior</w:t>
-      </w:r>
-    </w:p>
-    <w:p>
-      <w:pPr>
-        <w:pStyle w:val="Normal"/>
-        <w:bidi w:val="0"/>
-        <w:spacing w:lineRule="auto" w:line="240"/>
-        <w:jc w:val="start"/>
-        <w:rPr/>
-      </w:pPr>
-      <w:r>
-        <w:rPr>
-          <w:rFonts w:ascii="Times New Roman" w:hAnsi="Times New Roman"/>
-        </w:rPr>
-        <w:t>São Luís/MA</w:t>
-      </w:r>
-      <w:r>
-        <w:rPr>
-          <w:rFonts w:ascii="Times New Roman" w:hAnsi="Times New Roman"/>
-        </w:rPr>
-        <w:t xml:space="preserve"> | winston.almeidamjr@gmail.com | 98 9 9983-2637 | linkedin.com/in/winstonajr | github.com/winstonajr </w:t>
-      </w:r>
-      <w:r>
-        <w:rPr>
-          <w:rFonts w:ascii="Times New Roman" w:hAnsi="Times New Roman"/>
-        </w:rPr>
-        <w:t xml:space="preserve">| </w:t>
-      </w:r>
-      <w:r>
-        <w:rPr/>
-        <w:t>winstonajr.com.br</w:t>
-      </w:r>
-    </w:p>
-    <w:p>
-      <w:pPr>
-        <w:pStyle w:val="Normal"/>
-        <w:bidi w:val="0"/>
-        <w:jc w:val="start"/>
-        <w:rPr>
-          <w:rFonts w:ascii="Times New Roman" w:hAnsi="Times New Roman"/>
-        </w:rPr>
-      </w:pPr>
-      <w:r>
-        <w:rPr>
-          <w:rFonts w:ascii="Times New Roman" w:hAnsi="Times New Roman"/>
-        </w:rPr>
-      </w:r>
-    </w:p>
-    <w:p>
-      <w:pPr>
-        <w:pStyle w:val="Normal"/>
-        <w:bidi w:val="0"/>
-        <w:jc w:val="start"/>
-        <w:rPr>
-          <w:rFonts w:ascii="Times New Roman" w:hAnsi="Times New Roman"/>
-        </w:rPr>
-      </w:pPr>
-      <w:r>
-        <w:rPr>
-          <w:rFonts w:ascii="Times New Roman" w:hAnsi="Times New Roman"/>
+          <w:lang w:val="pt-BR"/>
+        </w:rPr>
+        <w:t>RESUMO PROFISSIONAL</w:t>
+      </w:r>
+    </w:p>
+    <w:p>
+      <w:pPr>
+        <w:pStyle w:val="Normal"/>
+        <w:bidi w:val="0"/>
+        <w:jc w:val="start"/>
+        <w:rPr>
+          <w:lang w:val="pt-BR"/>
+        </w:rPr>
+      </w:pPr>
+      <w:r>
+        <w:rPr>
+          <w:rFonts w:ascii="Times New Roman" w:hAnsi="Times New Roman"/>
+          <w:lang w:val="pt-BR"/>
+        </w:rPr>
+        <w:t xml:space="preserve">Desenvolvedor </w:t>
+      </w:r>
+      <w:r>
+        <w:rPr>
+          <w:rFonts w:ascii="Times New Roman" w:hAnsi="Times New Roman"/>
+          <w:b/>
+          <w:bCs/>
+          <w:lang w:val="pt-BR"/>
+        </w:rPr>
+        <w:t>Full Stack</w:t>
+      </w:r>
+      <w:r>
+        <w:rPr>
+          <w:rFonts w:ascii="Times New Roman" w:hAnsi="Times New Roman"/>
+          <w:lang w:val="pt-BR"/>
+        </w:rPr>
+        <w:t xml:space="preserve"> com experiência prática no ecossistema </w:t>
+      </w:r>
+      <w:r>
+        <w:rPr>
+          <w:rFonts w:ascii="Times New Roman" w:hAnsi="Times New Roman"/>
+          <w:b/>
+          <w:bCs/>
+          <w:lang w:val="pt-BR"/>
+        </w:rPr>
+        <w:t>JavaScript/TypeScript</w:t>
+      </w:r>
+      <w:r>
+        <w:rPr>
+          <w:rFonts w:ascii="Times New Roman" w:hAnsi="Times New Roman"/>
+          <w:lang w:val="pt-BR"/>
+        </w:rPr>
+        <w:t xml:space="preserve">. Atualmente em estágio ativo na </w:t>
+      </w:r>
+      <w:r>
+        <w:rPr>
+          <w:rFonts w:ascii="Times New Roman" w:hAnsi="Times New Roman"/>
+          <w:b/>
+          <w:bCs/>
+          <w:lang w:val="pt-BR"/>
+        </w:rPr>
+        <w:t>Prefeitura de São Luís</w:t>
+      </w:r>
+      <w:r>
+        <w:rPr>
+          <w:rFonts w:ascii="Times New Roman" w:hAnsi="Times New Roman"/>
+          <w:lang w:val="pt-BR"/>
+        </w:rPr>
+        <w:t xml:space="preserve">, onde atuo no desenvolvimento de aplicações </w:t>
+      </w:r>
+      <w:r>
+        <w:rPr>
+          <w:rFonts w:ascii="Times New Roman" w:hAnsi="Times New Roman"/>
+          <w:b/>
+          <w:bCs/>
+          <w:lang w:val="pt-BR"/>
+        </w:rPr>
+        <w:t>FullStack</w:t>
+      </w:r>
+      <w:r>
+        <w:rPr>
+          <w:rFonts w:ascii="Times New Roman" w:hAnsi="Times New Roman"/>
+          <w:lang w:val="pt-BR"/>
+        </w:rPr>
+        <w:t xml:space="preserve"> com </w:t>
+      </w:r>
+      <w:r>
+        <w:rPr>
+          <w:rFonts w:ascii="Times New Roman" w:hAnsi="Times New Roman"/>
+          <w:b/>
+          <w:bCs/>
+          <w:lang w:val="pt-BR"/>
+        </w:rPr>
+        <w:t>Next.js</w:t>
+      </w:r>
+      <w:r>
+        <w:rPr>
+          <w:rFonts w:ascii="Times New Roman" w:hAnsi="Times New Roman"/>
+          <w:lang w:val="pt-BR"/>
+        </w:rPr>
+        <w:t xml:space="preserve">, na arquitetura </w:t>
+      </w:r>
+      <w:r>
+        <w:rPr>
+          <w:rFonts w:ascii="Times New Roman" w:hAnsi="Times New Roman"/>
+          <w:b/>
+          <w:bCs/>
+          <w:lang w:val="pt-BR"/>
+        </w:rPr>
+        <w:t>offline-first</w:t>
+      </w:r>
+      <w:r>
+        <w:rPr>
+          <w:rFonts w:ascii="Times New Roman" w:hAnsi="Times New Roman"/>
+          <w:lang w:val="pt-BR"/>
+        </w:rPr>
+        <w:t xml:space="preserve"> em </w:t>
+      </w:r>
+      <w:r>
+        <w:rPr>
+          <w:rFonts w:ascii="Times New Roman" w:hAnsi="Times New Roman"/>
+          <w:b/>
+          <w:bCs/>
+          <w:lang w:val="pt-BR"/>
+        </w:rPr>
+        <w:t>Flutter</w:t>
+      </w:r>
+      <w:r>
+        <w:rPr>
+          <w:rFonts w:ascii="Times New Roman" w:hAnsi="Times New Roman"/>
+          <w:lang w:val="pt-BR"/>
+        </w:rPr>
+        <w:t xml:space="preserve"> e em projetos de </w:t>
+      </w:r>
+      <w:r>
+        <w:rPr>
+          <w:rFonts w:ascii="Times New Roman" w:hAnsi="Times New Roman"/>
+          <w:b/>
+          <w:bCs/>
+          <w:lang w:val="pt-BR"/>
+        </w:rPr>
+        <w:t>Inteligência Artificial (RAG)</w:t>
+      </w:r>
+      <w:r>
+        <w:rPr>
+          <w:rFonts w:ascii="Times New Roman" w:hAnsi="Times New Roman"/>
+          <w:lang w:val="pt-BR"/>
+        </w:rPr>
+        <w:t xml:space="preserve">. Possuo sólido domínio em </w:t>
+      </w:r>
+      <w:r>
+        <w:rPr>
+          <w:rFonts w:ascii="Times New Roman" w:hAnsi="Times New Roman"/>
+          <w:b/>
+          <w:bCs/>
+          <w:lang w:val="pt-BR"/>
+        </w:rPr>
+        <w:t>React</w:t>
+      </w:r>
+      <w:r>
+        <w:rPr>
+          <w:rFonts w:ascii="Times New Roman" w:hAnsi="Times New Roman"/>
+          <w:lang w:val="pt-BR"/>
+        </w:rPr>
+        <w:t xml:space="preserve">, </w:t>
+      </w:r>
+      <w:r>
+        <w:rPr>
+          <w:rFonts w:ascii="Times New Roman" w:hAnsi="Times New Roman"/>
+          <w:b/>
+          <w:bCs/>
+          <w:lang w:val="pt-BR"/>
+        </w:rPr>
+        <w:t>Next.js</w:t>
+      </w:r>
+      <w:r>
+        <w:rPr>
+          <w:rFonts w:ascii="Times New Roman" w:hAnsi="Times New Roman"/>
+          <w:lang w:val="pt-BR"/>
+        </w:rPr>
+        <w:t xml:space="preserve">, </w:t>
+      </w:r>
+      <w:r>
+        <w:rPr>
+          <w:rFonts w:ascii="Times New Roman" w:hAnsi="Times New Roman"/>
+          <w:b/>
+          <w:bCs/>
+          <w:lang w:val="pt-BR"/>
+        </w:rPr>
+        <w:t>Node.js</w:t>
+      </w:r>
+      <w:r>
+        <w:rPr>
+          <w:rFonts w:ascii="Times New Roman" w:hAnsi="Times New Roman"/>
+          <w:lang w:val="pt-BR"/>
+        </w:rPr>
+        <w:t xml:space="preserve"> e bancos de dados </w:t>
+      </w:r>
+      <w:r>
+        <w:rPr>
+          <w:rFonts w:ascii="Times New Roman" w:hAnsi="Times New Roman"/>
+          <w:b/>
+          <w:bCs/>
+          <w:lang w:val="pt-BR"/>
+        </w:rPr>
+        <w:t>SQL/NoSQL</w:t>
+      </w:r>
+      <w:r>
+        <w:rPr>
+          <w:rFonts w:ascii="Times New Roman" w:hAnsi="Times New Roman"/>
+          <w:lang w:val="pt-BR"/>
+        </w:rPr>
+        <w:t xml:space="preserve">, com experiência em </w:t>
+      </w:r>
+      <w:r>
+        <w:rPr>
+          <w:rFonts w:ascii="Times New Roman" w:hAnsi="Times New Roman"/>
+          <w:b/>
+          <w:bCs/>
+          <w:lang w:val="pt-BR"/>
+        </w:rPr>
+        <w:t>Clean Architecture</w:t>
+      </w:r>
+      <w:r>
+        <w:rPr>
+          <w:rFonts w:ascii="Times New Roman" w:hAnsi="Times New Roman"/>
+          <w:lang w:val="pt-BR"/>
+        </w:rPr>
+        <w:t>, metodologias ágeis (</w:t>
+      </w:r>
+      <w:r>
+        <w:rPr>
+          <w:rFonts w:ascii="Times New Roman" w:hAnsi="Times New Roman"/>
+          <w:b/>
+          <w:bCs/>
+          <w:lang w:val="pt-BR"/>
+        </w:rPr>
+        <w:t>Scrum/Kanban</w:t>
+      </w:r>
+      <w:r>
+        <w:rPr>
+          <w:rFonts w:ascii="Times New Roman" w:hAnsi="Times New Roman"/>
+          <w:lang w:val="pt-BR"/>
+        </w:rPr>
+        <w:t xml:space="preserve">) e colaboração multidisciplinar. Busco uma oportunidade como </w:t>
+      </w:r>
+      <w:r>
+        <w:rPr>
+          <w:rFonts w:ascii="Times New Roman" w:hAnsi="Times New Roman"/>
+          <w:b/>
+          <w:bCs/>
+          <w:lang w:val="pt-BR"/>
+        </w:rPr>
+        <w:t>Desenvolvedor Júnior</w:t>
+      </w:r>
+      <w:r>
+        <w:rPr>
+          <w:rFonts w:ascii="Times New Roman" w:hAnsi="Times New Roman"/>
+          <w:lang w:val="pt-BR"/>
+        </w:rPr>
+        <w:t xml:space="preserve"> para continuar crescendo e entregando soluções completas de ponta a ponta.</w:t>
+      </w:r>
+    </w:p>
+    <w:p>
+      <w:pPr>
+        <w:pStyle w:val="Normal"/>
+        <w:bidi w:val="0"/>
+        <w:jc w:val="start"/>
+        <w:rPr>
+          <w:rFonts w:ascii="Times New Roman" w:hAnsi="Times New Roman"/>
+          <w:lang w:val="pt-BR"/>
+        </w:rPr>
+      </w:pPr>
+      <w:r>
+        <w:rPr>
+          <w:rFonts w:ascii="Times New Roman" w:hAnsi="Times New Roman"/>
+          <w:lang w:val="pt-BR"/>
+        </w:rPr>
+      </w:r>
+    </w:p>
+    <w:p>
+      <w:pPr>
+        <w:pStyle w:val="Normal"/>
+        <w:bidi w:val="0"/>
+        <w:jc w:val="start"/>
+        <w:rPr>
+          <w:rFonts w:ascii="Times New Roman" w:hAnsi="Times New Roman"/>
+          <w:lang w:val="pt-BR"/>
+        </w:rPr>
+      </w:pPr>
+      <w:r>
+        <w:rPr>
+          <w:rFonts w:ascii="Times New Roman" w:hAnsi="Times New Roman"/>
+          <w:lang w:val="pt-BR"/>
         </w:rPr>
       </w:r>
     </w:p>
@@ -96,6 +403,11 @@
         <w:bidi w:val="0"/>
         <w:spacing w:lineRule="auto" w:line="276"/>
         <w:jc w:val="start"/>
+        <w:rPr>
+          <w:lang w:val="pt-BR"/>
+        </w:rPr>
+      </w:pPr>
+      <w:r>
         <w:rPr>
           <w:rFonts w:ascii="Times New Roman" w:hAnsi="Times New Roman"/>
           <w:b/>
@@ -103,6 +415,105 @@
           <w:color w:val="2A6099"/>
           <w:sz w:val="28"/>
           <w:szCs w:val="28"/>
+          <w:lang w:val="pt-BR"/>
+        </w:rPr>
+        <w:t>FORMAÇÃO ACADÊMICA</w:t>
+      </w:r>
+    </w:p>
+    <w:p>
+      <w:pPr>
+        <w:pStyle w:val="Normal"/>
+        <w:bidi w:val="0"/>
+        <w:jc w:val="start"/>
+        <w:rPr>
+          <w:lang w:val="pt-BR"/>
+        </w:rPr>
+      </w:pPr>
+      <w:r>
+        <w:rPr>
+          <w:rFonts w:ascii="Times New Roman" w:hAnsi="Times New Roman"/>
+          <w:b/>
+          <w:bCs/>
+          <w:lang w:val="pt-BR"/>
+        </w:rPr>
+        <w:t>Análise e Desenvolvimento de Sistemas</w:t>
+      </w:r>
+      <w:r>
+        <w:rPr>
+          <w:rFonts w:ascii="Times New Roman" w:hAnsi="Times New Roman"/>
+          <w:lang w:val="pt-BR"/>
+        </w:rPr>
+        <w:t xml:space="preserve"> – Faculdade Facint | Fev/2025 – Presente </w:t>
+      </w:r>
+    </w:p>
+    <w:p>
+      <w:pPr>
+        <w:pStyle w:val="Normal"/>
+        <w:bidi w:val="0"/>
+        <w:jc w:val="start"/>
+        <w:rPr>
+          <w:lang w:val="pt-BR"/>
+        </w:rPr>
+      </w:pPr>
+      <w:r>
+        <w:rPr>
+          <w:rFonts w:ascii="Times New Roman" w:hAnsi="Times New Roman"/>
+          <w:b/>
+          <w:bCs/>
+          <w:lang w:val="pt-BR"/>
+        </w:rPr>
+        <w:t>Interdisciplinar em Ciência e Tecnologia</w:t>
+      </w:r>
+      <w:r>
+        <w:rPr>
+          <w:rFonts w:ascii="Times New Roman" w:hAnsi="Times New Roman"/>
+          <w:lang w:val="pt-BR"/>
+        </w:rPr>
+        <w:t xml:space="preserve"> (Não concluído) – Universidade Federal do Maranhão (UFMA) | Ago/2020 – Fev/2025</w:t>
+      </w:r>
+    </w:p>
+    <w:p>
+      <w:pPr>
+        <w:pStyle w:val="Normal"/>
+        <w:bidi w:val="0"/>
+        <w:jc w:val="start"/>
+        <w:rPr>
+          <w:rFonts w:ascii="Times New Roman" w:hAnsi="Times New Roman"/>
+          <w:lang w:val="pt-BR"/>
+        </w:rPr>
+      </w:pPr>
+      <w:r>
+        <w:rPr>
+          <w:rFonts w:ascii="Times New Roman" w:hAnsi="Times New Roman"/>
+          <w:lang w:val="pt-BR"/>
+        </w:rPr>
+      </w:r>
+    </w:p>
+    <w:p>
+      <w:pPr>
+        <w:pStyle w:val="Normal"/>
+        <w:bidi w:val="0"/>
+        <w:jc w:val="start"/>
+        <w:rPr>
+          <w:rFonts w:ascii="Times New Roman" w:hAnsi="Times New Roman"/>
+          <w:lang w:val="pt-BR"/>
+        </w:rPr>
+      </w:pPr>
+      <w:r>
+        <w:rPr>
+          <w:rFonts w:ascii="Times New Roman" w:hAnsi="Times New Roman"/>
+          <w:lang w:val="pt-BR"/>
+        </w:rPr>
+      </w:r>
+    </w:p>
+    <w:p>
+      <w:pPr>
+        <w:pStyle w:val="Normal"/>
+        <w:bidi w:val="0"/>
+        <w:spacing w:lineRule="auto" w:line="276"/>
+        <w:jc w:val="start"/>
+        <w:rPr>
+          <w:lang w:val="pt-BR"/>
         </w:rPr>
       </w:pPr>
       <w:r>
@@ -113,179 +524,59 @@
           <w:color w:val="2A6099"/>
           <w:sz w:val="28"/>
           <w:szCs w:val="28"/>
-        </w:rPr>
-        <w:t>RESUMO PROFISSIONAL</w:t>
-      </w:r>
-    </w:p>
-    <w:p>
-      <w:pPr>
-        <w:pStyle w:val="Normal"/>
-        <w:bidi w:val="0"/>
-        <w:jc w:val="start"/>
-        <w:rPr>
-          <w:rFonts w:ascii="Times New Roman" w:hAnsi="Times New Roman"/>
-        </w:rPr>
-      </w:pPr>
-      <w:r>
-        <w:rPr>
-          <w:rFonts w:ascii="Times New Roman" w:hAnsi="Times New Roman"/>
-        </w:rPr>
-        <w:t xml:space="preserve">Desenvolvedor focado no ecossistema </w:t>
-      </w:r>
-      <w:r>
-        <w:rPr>
-          <w:rFonts w:ascii="Times New Roman" w:hAnsi="Times New Roman"/>
-          <w:b/>
-          <w:bCs/>
-        </w:rPr>
-        <w:t>JavaScript/TypeScript</w:t>
-      </w:r>
-      <w:r>
-        <w:rPr>
-          <w:rFonts w:ascii="Times New Roman" w:hAnsi="Times New Roman"/>
-        </w:rPr>
-        <w:t>. Possuo forte domínio em tecnologias de interface (</w:t>
-      </w:r>
-      <w:r>
-        <w:rPr>
-          <w:rFonts w:ascii="Times New Roman" w:hAnsi="Times New Roman"/>
-          <w:b/>
-          <w:bCs/>
-        </w:rPr>
-        <w:t>React</w:t>
-      </w:r>
-      <w:r>
-        <w:rPr>
-          <w:rFonts w:ascii="Times New Roman" w:hAnsi="Times New Roman"/>
-        </w:rPr>
-        <w:t xml:space="preserve">, </w:t>
-      </w:r>
-      <w:r>
-        <w:rPr>
-          <w:rFonts w:ascii="Times New Roman" w:hAnsi="Times New Roman"/>
-          <w:b/>
-          <w:bCs/>
-        </w:rPr>
-        <w:t>Next.js</w:t>
-      </w:r>
-      <w:r>
-        <w:rPr>
-          <w:rFonts w:ascii="Times New Roman" w:hAnsi="Times New Roman"/>
-        </w:rPr>
-        <w:t xml:space="preserve">) e sólida base na construção de </w:t>
-      </w:r>
-      <w:r>
-        <w:rPr>
-          <w:rFonts w:ascii="Times New Roman" w:hAnsi="Times New Roman"/>
-          <w:b/>
-          <w:bCs/>
-        </w:rPr>
-        <w:t>APIs</w:t>
-      </w:r>
-      <w:r>
-        <w:rPr>
-          <w:rFonts w:ascii="Times New Roman" w:hAnsi="Times New Roman"/>
-        </w:rPr>
-        <w:t xml:space="preserve"> e </w:t>
-      </w:r>
-      <w:r>
-        <w:rPr>
-          <w:rFonts w:ascii="Times New Roman" w:hAnsi="Times New Roman"/>
-          <w:b/>
-          <w:bCs/>
-        </w:rPr>
-        <w:t>back-end</w:t>
-      </w:r>
-      <w:r>
-        <w:rPr>
-          <w:rFonts w:ascii="Times New Roman" w:hAnsi="Times New Roman"/>
-        </w:rPr>
-        <w:t xml:space="preserve"> (</w:t>
-      </w:r>
-      <w:r>
-        <w:rPr>
-          <w:rFonts w:ascii="Times New Roman" w:hAnsi="Times New Roman"/>
-          <w:b/>
-          <w:bCs/>
-        </w:rPr>
-        <w:t>Node.js</w:t>
-      </w:r>
-      <w:r>
-        <w:rPr>
-          <w:rFonts w:ascii="Times New Roman" w:hAnsi="Times New Roman"/>
-        </w:rPr>
-        <w:t xml:space="preserve">, </w:t>
-      </w:r>
-      <w:r>
-        <w:rPr>
-          <w:rFonts w:ascii="Times New Roman" w:hAnsi="Times New Roman"/>
-          <w:b/>
-          <w:bCs/>
-        </w:rPr>
-        <w:t>Fastify</w:t>
-      </w:r>
-      <w:r>
-        <w:rPr>
-          <w:rFonts w:ascii="Times New Roman" w:hAnsi="Times New Roman"/>
-        </w:rPr>
-        <w:t xml:space="preserve">) com bancos de dados </w:t>
-      </w:r>
-      <w:r>
-        <w:rPr>
-          <w:rFonts w:ascii="Times New Roman" w:hAnsi="Times New Roman"/>
-          <w:b/>
-          <w:bCs/>
-        </w:rPr>
-        <w:t>SQL/NoSQL</w:t>
-      </w:r>
-      <w:r>
-        <w:rPr>
-          <w:rFonts w:ascii="Times New Roman" w:hAnsi="Times New Roman"/>
-        </w:rPr>
-        <w:t>. Com experiência em metodologias ágeis (</w:t>
-      </w:r>
-      <w:r>
-        <w:rPr>
-          <w:rFonts w:ascii="Times New Roman" w:hAnsi="Times New Roman"/>
-          <w:b/>
-          <w:bCs/>
-        </w:rPr>
-        <w:t>Scrum/Kanban</w:t>
-      </w:r>
-      <w:r>
-        <w:rPr>
-          <w:rFonts w:ascii="Times New Roman" w:hAnsi="Times New Roman"/>
-        </w:rPr>
-        <w:t>), busco entregar soluções completas, performáticas e otimizadas de ponta a ponta. Atualmente, busco minha primeira oportunidade profissional como Desenvolvedor Júnior ou Estagiário.</w:t>
-      </w:r>
-    </w:p>
-    <w:p>
-      <w:pPr>
-        <w:pStyle w:val="Normal"/>
-        <w:bidi w:val="0"/>
-        <w:jc w:val="start"/>
-        <w:rPr>
-          <w:rFonts w:ascii="Times New Roman" w:hAnsi="Times New Roman"/>
-        </w:rPr>
-      </w:pPr>
-      <w:r>
-        <w:rPr>
-          <w:rFonts w:ascii="Times New Roman" w:hAnsi="Times New Roman"/>
-        </w:rPr>
-      </w:r>
-    </w:p>
-    <w:p>
-      <w:pPr>
-        <w:pStyle w:val="Normal"/>
-        <w:bidi w:val="0"/>
-        <w:jc w:val="start"/>
-        <w:rPr>
-          <w:rFonts w:ascii="Times New Roman" w:hAnsi="Times New Roman"/>
-        </w:rPr>
-      </w:pPr>
-      <w:r>
-        <w:rPr>
-          <w:rFonts w:ascii="Times New Roman" w:hAnsi="Times New Roman"/>
+          <w:lang w:val="pt-BR"/>
+        </w:rPr>
+        <w:t>COMPETÊNCIAS TÉCNICAS</w:t>
+      </w:r>
+    </w:p>
+    <w:p>
+      <w:pPr>
+        <w:pStyle w:val="Normal"/>
+        <w:bidi w:val="0"/>
+        <w:jc w:val="start"/>
+        <w:rPr>
+          <w:lang w:val="pt-BR"/>
+        </w:rPr>
+      </w:pPr>
+      <w:r>
+        <w:rPr>
+          <w:rFonts w:ascii="Times New Roman" w:hAnsi="Times New Roman"/>
+          <w:lang w:val="pt-BR"/>
+        </w:rPr>
+        <w:t>JavaScript, TypeScript  | React, Next.js, Vue.js, Flutter  | Tailwind CSS, SASS, Bootstrap  | Node.js, Express.js, Fastify  | PostgreSQL, SQLite, MySQL, MongoDB  | Prisma ORM  | REST APIs, JWT, SSE, RAG  | Clean Architecture, MVC, Scrum, Kanban  | Git, GitHub, Docker, Vercel, Supabase, Sanity.io  | VSCode  | Windows, Linux  | UX/UI: Figma, prototipação de interfaces</w:t>
+      </w:r>
+    </w:p>
+    <w:p>
+      <w:pPr>
+        <w:pStyle w:val="Normal"/>
+        <w:bidi w:val="0"/>
+        <w:jc w:val="start"/>
+        <w:rPr>
+          <w:rFonts w:ascii="Times New Roman" w:hAnsi="Times New Roman"/>
+          <w:lang w:val="pt-BR"/>
+        </w:rPr>
+      </w:pPr>
+      <w:r>
+        <w:rPr>
+          <w:rFonts w:ascii="Times New Roman" w:hAnsi="Times New Roman"/>
+          <w:lang w:val="pt-BR"/>
+        </w:rPr>
+      </w:r>
+    </w:p>
+    <w:p>
+      <w:pPr>
+        <w:pStyle w:val="Normal"/>
+        <w:bidi w:val="0"/>
+        <w:jc w:val="start"/>
+        <w:rPr>
+          <w:rFonts w:ascii="Times New Roman" w:hAnsi="Times New Roman"/>
+          <w:lang w:val="pt-BR"/>
+        </w:rPr>
+      </w:pPr>
+      <w:r>
+        <w:rPr>
+          <w:rFonts w:ascii="Times New Roman" w:hAnsi="Times New Roman"/>
+          <w:lang w:val="pt-BR"/>
         </w:rPr>
       </w:r>
     </w:p>
@@ -302,6 +593,7 @@
           <w:color w:val="2A6099"/>
           <w:sz w:val="28"/>
           <w:szCs w:val="28"/>
+          <w:lang w:val="pt-BR"/>
         </w:rPr>
       </w:pPr>
       <w:r>
@@ -312,94 +604,9 @@
           <w:color w:val="2A6099"/>
           <w:sz w:val="28"/>
           <w:szCs w:val="28"/>
-        </w:rPr>
-        <w:t>FORMAÇÃO ACADÊMICA</w:t>
-      </w:r>
-    </w:p>
-    <w:p>
-      <w:pPr>
-        <w:pStyle w:val="Normal"/>
-        <w:bidi w:val="0"/>
-        <w:jc w:val="start"/>
-        <w:rPr>
-          <w:rFonts w:ascii="Times New Roman" w:hAnsi="Times New Roman"/>
-        </w:rPr>
-      </w:pPr>
-      <w:r>
-        <w:rPr>
-          <w:rFonts w:ascii="Times New Roman" w:hAnsi="Times New Roman"/>
-          <w:b/>
-          <w:bCs/>
-        </w:rPr>
-        <w:t>Análise e Desenvolvimento de Sistemas</w:t>
-      </w:r>
-      <w:r>
-        <w:rPr>
-          <w:rFonts w:ascii="Times New Roman" w:hAnsi="Times New Roman"/>
-        </w:rPr>
-        <w:t xml:space="preserve"> – Faculdade Facint | Fev/2025 – Presente </w:t>
-      </w:r>
-    </w:p>
-    <w:p>
-      <w:pPr>
-        <w:pStyle w:val="Normal"/>
-        <w:bidi w:val="0"/>
-        <w:jc w:val="start"/>
-        <w:rPr>
-          <w:rFonts w:ascii="Times New Roman" w:hAnsi="Times New Roman"/>
-        </w:rPr>
-      </w:pPr>
-      <w:r>
-        <w:rPr>
-          <w:rFonts w:ascii="Times New Roman" w:hAnsi="Times New Roman"/>
-          <w:b/>
-          <w:bCs/>
-        </w:rPr>
-        <w:t xml:space="preserve">Interdisciplinar em </w:t>
-      </w:r>
-      <w:r>
-        <w:rPr>
-          <w:rFonts w:ascii="Times New Roman" w:hAnsi="Times New Roman"/>
-          <w:b/>
-          <w:bCs/>
-        </w:rPr>
-        <w:t>Ciência e Tecnologia</w:t>
-      </w:r>
-      <w:r>
-        <w:rPr>
-          <w:rFonts w:ascii="Times New Roman" w:hAnsi="Times New Roman"/>
-        </w:rPr>
-        <w:t xml:space="preserve"> (Não concluído) – Universidade Federal do Maranhão (UFMA) | Ago/2020 – Fev/2025</w:t>
-      </w:r>
-    </w:p>
-    <w:p>
-      <w:pPr>
-        <w:pStyle w:val="Normal"/>
-        <w:bidi w:val="0"/>
-        <w:jc w:val="start"/>
-        <w:rPr>
-          <w:rFonts w:ascii="Times New Roman" w:hAnsi="Times New Roman"/>
-        </w:rPr>
-      </w:pPr>
-      <w:r>
-        <w:rPr>
-          <w:rFonts w:ascii="Times New Roman" w:hAnsi="Times New Roman"/>
-        </w:rPr>
-      </w:r>
-    </w:p>
-    <w:p>
-      <w:pPr>
-        <w:pStyle w:val="Normal"/>
-        <w:bidi w:val="0"/>
-        <w:jc w:val="start"/>
-        <w:rPr>
-          <w:rFonts w:ascii="Times New Roman" w:hAnsi="Times New Roman"/>
-        </w:rPr>
-      </w:pPr>
-      <w:r>
-        <w:rPr>
-          <w:rFonts w:ascii="Times New Roman" w:hAnsi="Times New Roman"/>
-        </w:rPr>
+          <w:lang w:val="pt-BR"/>
+        </w:rPr>
+        <w:t>EXPERIÊNCIAS PROFISSIONAIS</w:t>
       </w:r>
     </w:p>
     <w:p>
@@ -415,6 +622,7 @@
           <w:color w:val="2A6099"/>
           <w:sz w:val="28"/>
           <w:szCs w:val="28"/>
+          <w:lang w:val="pt-BR"/>
         </w:rPr>
       </w:pPr>
       <w:r>
@@ -425,208 +633,8 @@
           <w:color w:val="2A6099"/>
           <w:sz w:val="28"/>
           <w:szCs w:val="28"/>
-        </w:rPr>
-        <w:t>COMPETÊNCIAS TÉCNICAS</w:t>
-      </w:r>
-    </w:p>
-    <w:p>
-      <w:pPr>
-        <w:pStyle w:val="Normal"/>
-        <w:bidi w:val="0"/>
-        <w:jc w:val="start"/>
-        <w:rPr>
-          <w:rFonts w:ascii="Times New Roman" w:hAnsi="Times New Roman"/>
-        </w:rPr>
-      </w:pPr>
-      <w:r>
-        <w:rPr>
-          <w:rFonts w:ascii="Times New Roman" w:hAnsi="Times New Roman"/>
-        </w:rPr>
-        <w:t xml:space="preserve">JavaScript, TypeScript  | React, Next.js, Vue.js, Tailwind CSS, </w:t>
-      </w:r>
-      <w:r>
-        <w:rPr>
-          <w:rFonts w:ascii="Times New Roman" w:hAnsi="Times New Roman"/>
-        </w:rPr>
-        <w:t>SASS, Bootstrap</w:t>
-      </w:r>
-      <w:r>
-        <w:rPr>
-          <w:rFonts w:ascii="Times New Roman" w:hAnsi="Times New Roman"/>
-        </w:rPr>
-        <w:t xml:space="preserve">  | Node.js, Express.js, </w:t>
-      </w:r>
-      <w:r>
-        <w:rPr>
-          <w:rFonts w:ascii="Times New Roman" w:hAnsi="Times New Roman"/>
-        </w:rPr>
-        <w:t>Fastify</w:t>
-      </w:r>
-      <w:r>
-        <w:rPr>
-          <w:rFonts w:ascii="Times New Roman" w:hAnsi="Times New Roman"/>
-        </w:rPr>
-        <w:t xml:space="preserve">  | PostgreSQL, SQLite, MySQL, MongoDB  | Scrum, Kanban  | Git, GitHub, Vercel, Supabase, VSCode  | </w:t>
-      </w:r>
-      <w:r>
-        <w:rPr>
-          <w:rFonts w:ascii="Times New Roman" w:hAnsi="Times New Roman"/>
-        </w:rPr>
-        <w:t>Windows, Linux</w:t>
-      </w:r>
-    </w:p>
-    <w:p>
-      <w:pPr>
-        <w:pStyle w:val="Normal"/>
-        <w:bidi w:val="0"/>
-        <w:jc w:val="start"/>
-        <w:rPr>
-          <w:rFonts w:ascii="Times New Roman" w:hAnsi="Times New Roman"/>
-        </w:rPr>
-      </w:pPr>
-      <w:r>
-        <w:rPr>
-          <w:rFonts w:ascii="Times New Roman" w:hAnsi="Times New Roman"/>
-        </w:rPr>
-      </w:r>
-    </w:p>
-    <w:p>
-      <w:pPr>
-        <w:pStyle w:val="Normal"/>
-        <w:bidi w:val="0"/>
-        <w:jc w:val="start"/>
-        <w:rPr>
-          <w:rFonts w:ascii="Times New Roman" w:hAnsi="Times New Roman"/>
-        </w:rPr>
-      </w:pPr>
-      <w:r>
-        <w:rPr>
-          <w:rFonts w:ascii="Times New Roman" w:hAnsi="Times New Roman"/>
-        </w:rPr>
-      </w:r>
-    </w:p>
-    <w:p>
-      <w:pPr>
-        <w:pStyle w:val="Normal"/>
-        <w:bidi w:val="0"/>
-        <w:spacing w:lineRule="auto" w:line="276"/>
-        <w:jc w:val="start"/>
-        <w:rPr>
-          <w:rFonts w:ascii="Times New Roman" w:hAnsi="Times New Roman"/>
-          <w:b/>
-          <w:bCs/>
-          <w:color w:val="2A6099"/>
-          <w:sz w:val="28"/>
-          <w:szCs w:val="28"/>
-        </w:rPr>
-      </w:pPr>
-      <w:r>
-        <w:rPr>
-          <w:rFonts w:ascii="Times New Roman" w:hAnsi="Times New Roman"/>
-          <w:b/>
-          <w:bCs/>
-          <w:color w:val="2A6099"/>
-          <w:sz w:val="28"/>
-          <w:szCs w:val="28"/>
-        </w:rPr>
-        <w:t>UX/UI DESIGN E PROTOTIPAÇÃO</w:t>
-      </w:r>
-    </w:p>
-    <w:p>
-      <w:pPr>
-        <w:pStyle w:val="Normal"/>
-        <w:numPr>
-          <w:ilvl w:val="0"/>
-          <w:numId w:val="2"/>
-        </w:numPr>
-        <w:bidi w:val="0"/>
-        <w:jc w:val="start"/>
-        <w:rPr>
-          <w:rFonts w:ascii="Times New Roman" w:hAnsi="Times New Roman"/>
-        </w:rPr>
-      </w:pPr>
-      <w:r>
-        <w:rPr>
-          <w:rFonts w:ascii="Times New Roman" w:hAnsi="Times New Roman"/>
-        </w:rPr>
-        <w:t>Conhecimento avançado na criação e prototipação de interfaces com foco em experiência do usuário.</w:t>
-      </w:r>
-    </w:p>
-    <w:p>
-      <w:pPr>
-        <w:pStyle w:val="Normal"/>
-        <w:numPr>
-          <w:ilvl w:val="0"/>
-          <w:numId w:val="2"/>
-        </w:numPr>
-        <w:bidi w:val="0"/>
-        <w:jc w:val="start"/>
-        <w:rPr>
-          <w:rFonts w:ascii="Times New Roman" w:hAnsi="Times New Roman"/>
-        </w:rPr>
-      </w:pPr>
-      <w:r>
-        <w:rPr>
-          <w:rFonts w:ascii="Times New Roman" w:hAnsi="Times New Roman"/>
-        </w:rPr>
-        <w:t>Transformação direta de designs em código limpo, sem perda de fidelidade.</w:t>
-      </w:r>
-    </w:p>
-    <w:p>
-      <w:pPr>
-        <w:pStyle w:val="Normal"/>
-        <w:bidi w:val="0"/>
-        <w:jc w:val="start"/>
-        <w:rPr>
-          <w:rFonts w:ascii="Times New Roman" w:hAnsi="Times New Roman"/>
-        </w:rPr>
-      </w:pPr>
-      <w:r>
-        <w:rPr>
-          <w:rFonts w:ascii="Times New Roman" w:hAnsi="Times New Roman"/>
-        </w:rPr>
-      </w:r>
-    </w:p>
-    <w:p>
-      <w:pPr>
-        <w:pStyle w:val="Normal"/>
-        <w:bidi w:val="0"/>
-        <w:jc w:val="start"/>
-        <w:rPr>
-          <w:rFonts w:ascii="Times New Roman" w:hAnsi="Times New Roman"/>
-        </w:rPr>
-      </w:pPr>
-      <w:r>
-        <w:rPr>
-          <w:rFonts w:ascii="Times New Roman" w:hAnsi="Times New Roman"/>
-        </w:rPr>
-      </w:r>
-    </w:p>
-    <w:p>
-      <w:pPr>
-        <w:pStyle w:val="Normal"/>
-        <w:bidi w:val="0"/>
-        <w:spacing w:lineRule="auto" w:line="276"/>
-        <w:jc w:val="start"/>
-        <w:rPr>
-          <w:rFonts w:ascii="Times New Roman" w:hAnsi="Times New Roman"/>
-          <w:b/>
-          <w:bCs/>
-          <w:color w:val="2A6099"/>
-          <w:sz w:val="28"/>
-          <w:szCs w:val="28"/>
-        </w:rPr>
-      </w:pPr>
-      <w:r>
-        <w:rPr>
-          <w:rFonts w:ascii="Times New Roman" w:hAnsi="Times New Roman"/>
-          <w:b/>
-          <w:bCs/>
-          <w:color w:val="2A6099"/>
-          <w:sz w:val="28"/>
-          <w:szCs w:val="28"/>
-        </w:rPr>
-        <w:t>EXPERIÊNCIAS PROFISSIONAIS</w:t>
+          <w:lang w:val="pt-BR"/>
+        </w:rPr>
       </w:r>
     </w:p>
     <w:p>
@@ -638,41 +646,99 @@
         </w:numPr>
         <w:bidi w:val="0"/>
         <w:jc w:val="start"/>
-        <w:rPr/>
-      </w:pPr>
-      <w:r>
-        <w:rPr>
-          <w:rFonts w:ascii="Times New Roman" w:hAnsi="Times New Roman"/>
-          <w:b/>
-          <w:bCs/>
-        </w:rPr>
-        <w:t>Estágio Desenvolvedor Front End</w:t>
-      </w:r>
-      <w:r>
-        <w:rPr>
-          <w:rFonts w:ascii="Times New Roman" w:hAnsi="Times New Roman"/>
-        </w:rPr>
-        <w:t xml:space="preserve"> – QaCoders Academy | Ago/2025 – </w:t>
-      </w:r>
-      <w:r>
-        <w:rPr>
-          <w:rFonts w:ascii="Times New Roman" w:hAnsi="Times New Roman"/>
-        </w:rPr>
-        <w:t>presente</w:t>
-      </w:r>
-    </w:p>
-    <w:p>
-      <w:pPr>
-        <w:pStyle w:val="Normal"/>
-        <w:bidi w:val="0"/>
-        <w:jc w:val="start"/>
-        <w:rPr>
-          <w:rFonts w:ascii="Times New Roman" w:hAnsi="Times New Roman"/>
-        </w:rPr>
-      </w:pPr>
-      <w:r>
-        <w:rPr>
-          <w:rFonts w:ascii="Times New Roman" w:hAnsi="Times New Roman"/>
+        <w:rPr>
+          <w:lang w:val="pt-BR"/>
+        </w:rPr>
+      </w:pPr>
+      <w:r>
+        <w:rPr>
+          <w:rFonts w:ascii="Times New Roman" w:hAnsi="Times New Roman"/>
+          <w:b/>
+          <w:bCs/>
+          <w:lang w:val="pt-BR"/>
+        </w:rPr>
+        <w:t>Desenvolvedor F</w:t>
+      </w:r>
+      <w:r>
+        <w:rPr>
+          <w:rFonts w:ascii="Times New Roman" w:hAnsi="Times New Roman"/>
+          <w:b/>
+          <w:bCs/>
+          <w:lang w:val="pt-BR"/>
+        </w:rPr>
+        <w:t xml:space="preserve">ull Stack </w:t>
+      </w:r>
+      <w:r>
+        <w:rPr>
+          <w:b/>
+          <w:bCs/>
+          <w:lang w:val="pt-BR"/>
+        </w:rPr>
+        <w:t>(Estágio)</w:t>
+      </w:r>
+      <w:r>
+        <w:rPr>
+          <w:rFonts w:ascii="Times New Roman" w:hAnsi="Times New Roman"/>
+          <w:lang w:val="pt-BR"/>
+        </w:rPr>
+        <w:t xml:space="preserve"> – </w:t>
+      </w:r>
+      <w:r>
+        <w:rPr>
+          <w:rFonts w:ascii="Times New Roman" w:hAnsi="Times New Roman"/>
+          <w:lang w:val="pt-BR"/>
+        </w:rPr>
+        <w:t>Prefeitura de São Luís</w:t>
+      </w:r>
+      <w:r>
+        <w:rPr>
+          <w:rFonts w:ascii="Times New Roman" w:hAnsi="Times New Roman"/>
+          <w:lang w:val="pt-BR"/>
+        </w:rPr>
+        <w:t xml:space="preserve"> | </w:t>
+      </w:r>
+      <w:r>
+        <w:rPr>
+          <w:rFonts w:ascii="Times New Roman" w:hAnsi="Times New Roman"/>
+          <w:lang w:val="pt-BR"/>
+        </w:rPr>
+        <w:t>Mai</w:t>
+      </w:r>
+      <w:r>
+        <w:rPr>
+          <w:rFonts w:ascii="Times New Roman" w:hAnsi="Times New Roman"/>
+          <w:lang w:val="pt-BR"/>
+        </w:rPr>
+        <w:t>/202</w:t>
+      </w:r>
+      <w:r>
+        <w:rPr>
+          <w:rFonts w:ascii="Times New Roman" w:hAnsi="Times New Roman"/>
+          <w:lang w:val="pt-BR"/>
+        </w:rPr>
+        <w:t>6</w:t>
+      </w:r>
+      <w:r>
+        <w:rPr>
+          <w:rFonts w:ascii="Times New Roman" w:hAnsi="Times New Roman"/>
+          <w:lang w:val="pt-BR"/>
+        </w:rPr>
+        <w:t xml:space="preserve"> – presente</w:t>
+      </w:r>
+    </w:p>
+    <w:p>
+      <w:pPr>
+        <w:pStyle w:val="Normal"/>
+        <w:bidi w:val="0"/>
+        <w:jc w:val="start"/>
+        <w:rPr>
+          <w:lang w:val="pt-BR"/>
+        </w:rPr>
+      </w:pPr>
+      <w:r>
+        <w:rPr>
+          <w:rFonts w:ascii="Times New Roman" w:hAnsi="Times New Roman"/>
+          <w:lang w:val="pt-BR"/>
         </w:rPr>
         <w:tab/>
         <w:t>Principais responsabilidades:</w:t>
@@ -685,11 +751,13 @@
         <w:jc w:val="start"/>
         <w:rPr>
           <w:rFonts w:ascii="Times New Roman" w:hAnsi="Times New Roman"/>
-        </w:rPr>
-      </w:pPr>
-      <w:r>
-        <w:rPr>
-          <w:rFonts w:ascii="Times New Roman" w:hAnsi="Times New Roman"/>
+          <w:lang w:val="pt-BR"/>
+        </w:rPr>
+      </w:pPr>
+      <w:r>
+        <w:rPr>
+          <w:rFonts w:ascii="Times New Roman" w:hAnsi="Times New Roman"/>
+          <w:lang w:val="pt-BR"/>
         </w:rPr>
       </w:r>
     </w:p>
@@ -702,77 +770,22 @@
         </w:numPr>
         <w:bidi w:val="0"/>
         <w:jc w:val="start"/>
-        <w:rPr/>
-      </w:pPr>
-      <w:r>
-        <w:rPr/>
-        <w:t xml:space="preserve">Desenvolvimento de aplicações reativas com </w:t>
-      </w:r>
-      <w:r>
-        <w:rPr>
-          <w:b/>
-          <w:bCs/>
-        </w:rPr>
-        <w:t>Next.js</w:t>
-      </w:r>
-      <w:r>
-        <w:rPr/>
-        <w:t xml:space="preserve">, </w:t>
-      </w:r>
-      <w:r>
-        <w:rPr>
-          <w:b/>
-          <w:bCs/>
-        </w:rPr>
-        <w:t>TypeScript</w:t>
-      </w:r>
-      <w:r>
-        <w:rPr/>
-        <w:t xml:space="preserve"> e </w:t>
-      </w:r>
-      <w:r>
-        <w:rPr>
-          <w:b/>
-          <w:bCs/>
-        </w:rPr>
-        <w:t>Tailwind</w:t>
-      </w:r>
-      <w:r>
-        <w:rPr/>
-        <w:t xml:space="preserve"> </w:t>
-      </w:r>
-      <w:r>
-        <w:rPr>
-          <w:b/>
-          <w:bCs/>
-        </w:rPr>
-        <w:t>CSS</w:t>
-      </w:r>
-      <w:r>
-        <w:rPr/>
-        <w:t xml:space="preserve">, aplicando conceitos de </w:t>
-      </w:r>
-      <w:r>
-        <w:rPr>
-          <w:b/>
-          <w:bCs/>
-        </w:rPr>
-        <w:t>Clean Architecture</w:t>
-      </w:r>
-      <w:r>
-        <w:rPr/>
-        <w:t xml:space="preserve"> e </w:t>
-      </w:r>
-      <w:r>
-        <w:rPr>
-          <w:b/>
-          <w:bCs/>
-        </w:rPr>
-        <w:t>MVC</w:t>
-      </w:r>
-      <w:r>
-        <w:rPr/>
-        <w:t>.</w:t>
+        <w:rPr>
+          <w:lang w:val="pt-BR"/>
+        </w:rPr>
+      </w:pPr>
+      <w:r>
+        <w:rPr>
+          <w:b/>
+          <w:lang w:val="pt-BR"/>
+        </w:rPr>
+        <w:t>Desenvolvimento FullStack &amp; Clean Architecture:</w:t>
+      </w:r>
+      <w:r>
+        <w:rPr>
+          <w:lang w:val="pt-BR"/>
+        </w:rPr>
+        <w:t xml:space="preserve"> Criação e evolução de aplicações reativas utilizando Next.js, TypeScript e Tailwind CSS, integradas a bancos de dados PostgreSQL via Prisma ORM, aplicando conceitos de Clean Architecture e MVC.</w:t>
       </w:r>
     </w:p>
     <w:p>
@@ -784,22 +797,22 @@
         </w:numPr>
         <w:bidi w:val="0"/>
         <w:jc w:val="start"/>
-        <w:rPr/>
-      </w:pPr>
-      <w:r>
-        <w:rPr/>
-        <w:t xml:space="preserve">Criação de interfaces complexas e interativas, como mecânicas de </w:t>
-      </w:r>
-      <w:r>
-        <w:rPr>
-          <w:b/>
-          <w:bCs/>
-        </w:rPr>
-        <w:t>drag-and-drop</w:t>
-      </w:r>
-      <w:r>
-        <w:rPr/>
-        <w:t xml:space="preserve"> para jogos e um sistema de leitura de arquivos (estilo EPUB) em tela.</w:t>
+        <w:rPr>
+          <w:lang w:val="pt-BR"/>
+        </w:rPr>
+      </w:pPr>
+      <w:r>
+        <w:rPr>
+          <w:b/>
+          <w:lang w:val="pt-BR"/>
+        </w:rPr>
+        <w:t>Arquitetura Mobile Offline-First:</w:t>
+      </w:r>
+      <w:r>
+        <w:rPr>
+          <w:lang w:val="pt-BR"/>
+        </w:rPr>
+        <w:t xml:space="preserve"> Otimização de banco de dados local e UI em aplicativo Flutter. Implementação de lógica avançada de sincronização de dados (Delta Sync com Timestamp) e Server-Sent Events (SSE) consumindo APIs em Spring Boot.</w:t>
       </w:r>
     </w:p>
     <w:p>
@@ -811,22 +824,22 @@
         </w:numPr>
         <w:bidi w:val="0"/>
         <w:jc w:val="start"/>
-        <w:rPr/>
-      </w:pPr>
-      <w:r>
-        <w:rPr/>
-        <w:t xml:space="preserve">Participação </w:t>
-      </w:r>
-      <w:r>
-        <w:rPr>
-          <w:b/>
-          <w:bCs/>
-        </w:rPr>
-        <w:t>estratégica nas decisões de produto</w:t>
-      </w:r>
-      <w:r>
-        <w:rPr/>
-        <w:t>, definindo abordagens técnicas viáveis para alinhar o desenvolvimento aos prazos estipulados.</w:t>
+        <w:rPr>
+          <w:lang w:val="pt-BR"/>
+        </w:rPr>
+      </w:pPr>
+      <w:r>
+        <w:rPr>
+          <w:b/>
+          <w:lang w:val="pt-BR"/>
+        </w:rPr>
+        <w:t>Sistemas de Inteligência Artificial (RAG):</w:t>
+      </w:r>
+      <w:r>
+        <w:rPr>
+          <w:lang w:val="pt-BR"/>
+        </w:rPr>
+        <w:t xml:space="preserve"> Atuação direta na modelagem e normalização de banco de dados para um projeto baseado em RAG (Retrieval-Augmented Generation), incluindo a redação da documentação técnica e implementação de testes unitários e End-to-End (E2E).</w:t>
       </w:r>
     </w:p>
     <w:p>
@@ -838,11 +851,22 @@
         </w:numPr>
         <w:bidi w:val="0"/>
         <w:jc w:val="start"/>
-        <w:rPr/>
-      </w:pPr>
-      <w:r>
-        <w:rPr/>
-        <w:t>Suporte técnico e mentoria informal para colegas desenvolvedores em desafios estruturais de código.</w:t>
+        <w:rPr>
+          <w:lang w:val="pt-BR"/>
+        </w:rPr>
+      </w:pPr>
+      <w:r>
+        <w:rPr>
+          <w:b/>
+          <w:lang w:val="pt-BR"/>
+        </w:rPr>
+        <w:t>Engenharia de Interfaces e UX/UI:</w:t>
+      </w:r>
+      <w:r>
+        <w:rPr>
+          <w:lang w:val="pt-BR"/>
+        </w:rPr>
+        <w:t xml:space="preserve"> Refatoração de interfaces e aplicação de novas regras de negócio, desenvolvendo componentes interativos complexos, como sistemas de drag-and-drop e visualizadores de arquivos em tela (estilo EPUB).</w:t>
       </w:r>
     </w:p>
     <w:p>
@@ -854,54 +878,374 @@
         </w:numPr>
         <w:bidi w:val="0"/>
         <w:jc w:val="start"/>
-        <w:rPr/>
-      </w:pPr>
-      <w:r>
-        <w:rPr/>
+        <w:rPr>
+          <w:lang w:val="pt-BR"/>
+        </w:rPr>
+      </w:pPr>
+      <w:r>
+        <w:rPr>
+          <w:b/>
+          <w:lang w:val="pt-BR"/>
+        </w:rPr>
+        <w:t>Visão de Produto &amp; Trabalho em Equipe:</w:t>
+      </w:r>
+      <w:r>
+        <w:rPr>
+          <w:lang w:val="pt-BR"/>
+        </w:rPr>
+        <w:t xml:space="preserve"> Participação estratégica na definição de abordagens técnicas alinhadas aos prazos do produto, colaborando de forma multidisciplinar (Back-end, QA e UX/UI) e prestando mentoria informal a colegas em desafios estruturais.</w:t>
+      </w:r>
+    </w:p>
+    <w:p>
+      <w:pPr>
+        <w:pStyle w:val="Normal"/>
+        <w:numPr>
+          <w:ilvl w:val="0"/>
+          <w:numId w:val="0"/>
+        </w:numPr>
+        <w:bidi w:val="0"/>
+        <w:ind w:hanging="0" w:start="1080"/>
+        <w:jc w:val="start"/>
+        <w:rPr>
+          <w:lang w:val="pt-BR"/>
+        </w:rPr>
+      </w:pPr>
+      <w:r>
+        <w:rPr>
+          <w:lang w:val="pt-BR"/>
+        </w:rPr>
+      </w:r>
+    </w:p>
+    <w:p>
+      <w:pPr>
+        <w:pStyle w:val="Normal"/>
+        <w:numPr>
+          <w:ilvl w:val="0"/>
+          <w:numId w:val="3"/>
+        </w:numPr>
+        <w:bidi w:val="0"/>
+        <w:jc w:val="start"/>
+        <w:rPr>
+          <w:lang w:val="pt-BR"/>
+        </w:rPr>
+      </w:pPr>
+      <w:r>
+        <w:rPr>
+          <w:rFonts w:ascii="Times New Roman" w:hAnsi="Times New Roman"/>
+          <w:b/>
+          <w:bCs/>
+          <w:lang w:val="pt-BR"/>
+        </w:rPr>
+        <w:t>Estágio Desenvolvedor Front End</w:t>
+      </w:r>
+      <w:r>
+        <w:rPr>
+          <w:rFonts w:ascii="Times New Roman" w:hAnsi="Times New Roman"/>
+          <w:lang w:val="pt-BR"/>
+        </w:rPr>
+        <w:t xml:space="preserve"> – QaCoders Academy | Ago/2025 – presente</w:t>
+      </w:r>
+    </w:p>
+    <w:p>
+      <w:pPr>
+        <w:pStyle w:val="Normal"/>
+        <w:bidi w:val="0"/>
+        <w:jc w:val="start"/>
+        <w:rPr>
+          <w:lang w:val="pt-BR"/>
+        </w:rPr>
+      </w:pPr>
+      <w:r>
+        <w:rPr>
+          <w:rFonts w:ascii="Times New Roman" w:hAnsi="Times New Roman"/>
+          <w:lang w:val="pt-BR"/>
+        </w:rPr>
+        <w:tab/>
+        <w:t>Principais responsabilidades:</w:t>
+      </w:r>
+    </w:p>
+    <w:p>
+      <w:pPr>
+        <w:pStyle w:val="Normal"/>
+        <w:bidi w:val="0"/>
+        <w:jc w:val="start"/>
+        <w:rPr>
+          <w:rFonts w:ascii="Times New Roman" w:hAnsi="Times New Roman"/>
+          <w:lang w:val="pt-BR"/>
+        </w:rPr>
+      </w:pPr>
+      <w:r>
+        <w:rPr>
+          <w:rFonts w:ascii="Times New Roman" w:hAnsi="Times New Roman"/>
+          <w:lang w:val="pt-BR"/>
+        </w:rPr>
+      </w:r>
+    </w:p>
+    <w:p>
+      <w:pPr>
+        <w:pStyle w:val="Normal"/>
+        <w:numPr>
+          <w:ilvl w:val="1"/>
+          <w:numId w:val="4"/>
+        </w:numPr>
+        <w:bidi w:val="0"/>
+        <w:jc w:val="start"/>
+        <w:rPr>
+          <w:lang w:val="pt-BR"/>
+        </w:rPr>
+      </w:pPr>
+      <w:r>
+        <w:rPr>
+          <w:lang w:val="pt-BR"/>
+        </w:rPr>
+        <w:t xml:space="preserve">Desenvolvimento de aplicações reativas com </w:t>
+      </w:r>
+      <w:r>
+        <w:rPr>
+          <w:b/>
+          <w:bCs/>
+          <w:lang w:val="pt-BR"/>
+        </w:rPr>
+        <w:t>Next.js</w:t>
+      </w:r>
+      <w:r>
+        <w:rPr>
+          <w:lang w:val="pt-BR"/>
+        </w:rPr>
+        <w:t xml:space="preserve">, </w:t>
+      </w:r>
+      <w:r>
+        <w:rPr>
+          <w:b/>
+          <w:bCs/>
+          <w:lang w:val="pt-BR"/>
+        </w:rPr>
+        <w:t>TypeScript</w:t>
+      </w:r>
+      <w:r>
+        <w:rPr>
+          <w:lang w:val="pt-BR"/>
+        </w:rPr>
+        <w:t xml:space="preserve"> e </w:t>
+      </w:r>
+      <w:r>
+        <w:rPr>
+          <w:b/>
+          <w:bCs/>
+          <w:lang w:val="pt-BR"/>
+        </w:rPr>
+        <w:t>Tailwind</w:t>
+      </w:r>
+      <w:r>
+        <w:rPr>
+          <w:lang w:val="pt-BR"/>
+        </w:rPr>
+        <w:t xml:space="preserve"> </w:t>
+      </w:r>
+      <w:r>
+        <w:rPr>
+          <w:b/>
+          <w:bCs/>
+          <w:lang w:val="pt-BR"/>
+        </w:rPr>
+        <w:t>CSS</w:t>
+      </w:r>
+      <w:r>
+        <w:rPr>
+          <w:lang w:val="pt-BR"/>
+        </w:rPr>
+        <w:t xml:space="preserve">, aplicando conceitos de </w:t>
+      </w:r>
+      <w:r>
+        <w:rPr>
+          <w:b/>
+          <w:bCs/>
+          <w:lang w:val="pt-BR"/>
+        </w:rPr>
+        <w:t>Clean Architecture</w:t>
+      </w:r>
+      <w:r>
+        <w:rPr>
+          <w:lang w:val="pt-BR"/>
+        </w:rPr>
+        <w:t xml:space="preserve"> e </w:t>
+      </w:r>
+      <w:r>
+        <w:rPr>
+          <w:b/>
+          <w:bCs/>
+          <w:lang w:val="pt-BR"/>
+        </w:rPr>
+        <w:t>MVC</w:t>
+      </w:r>
+      <w:r>
+        <w:rPr>
+          <w:lang w:val="pt-BR"/>
+        </w:rPr>
+        <w:t>.</w:t>
+      </w:r>
+    </w:p>
+    <w:p>
+      <w:pPr>
+        <w:pStyle w:val="Normal"/>
+        <w:numPr>
+          <w:ilvl w:val="1"/>
+          <w:numId w:val="4"/>
+        </w:numPr>
+        <w:bidi w:val="0"/>
+        <w:jc w:val="start"/>
+        <w:rPr>
+          <w:lang w:val="pt-BR"/>
+        </w:rPr>
+      </w:pPr>
+      <w:r>
+        <w:rPr>
+          <w:lang w:val="pt-BR"/>
+        </w:rPr>
+        <w:t xml:space="preserve">Criação de interfaces complexas e interativas, como mecânicas de </w:t>
+      </w:r>
+      <w:r>
+        <w:rPr>
+          <w:b/>
+          <w:bCs/>
+          <w:lang w:val="pt-BR"/>
+        </w:rPr>
+        <w:t>drag-and-drop</w:t>
+      </w:r>
+      <w:r>
+        <w:rPr>
+          <w:lang w:val="pt-BR"/>
+        </w:rPr>
+        <w:t xml:space="preserve"> para jogos e um sistema de leitura de arquivos (estilo EPUB) em tela.</w:t>
+      </w:r>
+    </w:p>
+    <w:p>
+      <w:pPr>
+        <w:pStyle w:val="Normal"/>
+        <w:numPr>
+          <w:ilvl w:val="1"/>
+          <w:numId w:val="4"/>
+        </w:numPr>
+        <w:bidi w:val="0"/>
+        <w:jc w:val="start"/>
+        <w:rPr>
+          <w:lang w:val="pt-BR"/>
+        </w:rPr>
+      </w:pPr>
+      <w:r>
+        <w:rPr>
+          <w:lang w:val="pt-BR"/>
+        </w:rPr>
+        <w:t xml:space="preserve">Participação </w:t>
+      </w:r>
+      <w:r>
+        <w:rPr>
+          <w:b/>
+          <w:bCs/>
+          <w:lang w:val="pt-BR"/>
+        </w:rPr>
+        <w:t>estratégica nas decisões de produto</w:t>
+      </w:r>
+      <w:r>
+        <w:rPr>
+          <w:lang w:val="pt-BR"/>
+        </w:rPr>
+        <w:t>, definindo abordagens técnicas viáveis para alinhar o desenvolvimento aos prazos estipulados.</w:t>
+      </w:r>
+    </w:p>
+    <w:p>
+      <w:pPr>
+        <w:pStyle w:val="Normal"/>
+        <w:numPr>
+          <w:ilvl w:val="1"/>
+          <w:numId w:val="4"/>
+        </w:numPr>
+        <w:bidi w:val="0"/>
+        <w:jc w:val="start"/>
+        <w:rPr>
+          <w:lang w:val="pt-BR"/>
+        </w:rPr>
+      </w:pPr>
+      <w:r>
+        <w:rPr>
+          <w:lang w:val="pt-BR"/>
+        </w:rPr>
+        <w:t>Suporte técnico e mentoria informal para colegas desenvolvedores em desafios estruturais de código.</w:t>
+      </w:r>
+    </w:p>
+    <w:p>
+      <w:pPr>
+        <w:pStyle w:val="Normal"/>
+        <w:numPr>
+          <w:ilvl w:val="1"/>
+          <w:numId w:val="4"/>
+        </w:numPr>
+        <w:bidi w:val="0"/>
+        <w:jc w:val="start"/>
+        <w:rPr>
+          <w:lang w:val="pt-BR"/>
+        </w:rPr>
+      </w:pPr>
+      <w:r>
+        <w:rPr>
+          <w:lang w:val="pt-BR"/>
+        </w:rPr>
         <w:t xml:space="preserve">Integração contínua de </w:t>
       </w:r>
       <w:r>
         <w:rPr>
           <w:b/>
           <w:bCs/>
+          <w:lang w:val="pt-BR"/>
         </w:rPr>
         <w:t>APIs</w:t>
       </w:r>
       <w:r>
-        <w:rPr/>
+        <w:rPr>
+          <w:lang w:val="pt-BR"/>
+        </w:rPr>
         <w:t xml:space="preserve"> e colaboração multidisciplinar com equipes de </w:t>
       </w:r>
       <w:r>
         <w:rPr>
           <w:b/>
           <w:bCs/>
+          <w:lang w:val="pt-BR"/>
         </w:rPr>
         <w:t>Back-end</w:t>
       </w:r>
       <w:r>
-        <w:rPr/>
+        <w:rPr>
+          <w:lang w:val="pt-BR"/>
+        </w:rPr>
         <w:t xml:space="preserve">, </w:t>
       </w:r>
       <w:r>
         <w:rPr>
           <w:b/>
           <w:bCs/>
+          <w:lang w:val="pt-BR"/>
         </w:rPr>
         <w:t>QA</w:t>
       </w:r>
       <w:r>
-        <w:rPr/>
+        <w:rPr>
+          <w:lang w:val="pt-BR"/>
+        </w:rPr>
         <w:t xml:space="preserve"> e </w:t>
       </w:r>
       <w:r>
         <w:rPr>
           <w:b/>
           <w:bCs/>
+          <w:lang w:val="pt-BR"/>
         </w:rPr>
         <w:t>UX/UI</w:t>
       </w:r>
       <w:r>
-        <w:rPr/>
+        <w:rPr>
+          <w:lang w:val="pt-BR"/>
+        </w:rPr>
         <w:t>.</w:t>
       </w:r>
     </w:p>
@@ -910,10 +1254,14 @@
         <w:pStyle w:val="Normal"/>
         <w:bidi w:val="0"/>
         <w:jc w:val="start"/>
-        <w:rPr/>
-      </w:pPr>
-      <w:r>
-        <w:rPr/>
+        <w:rPr>
+          <w:lang w:val="pt-BR"/>
+        </w:rPr>
+      </w:pPr>
+      <w:r>
+        <w:rPr>
+          <w:lang w:val="pt-BR"/>
+        </w:rPr>
       </w:r>
     </w:p>
     <w:p>
@@ -925,19 +1273,23 @@
         </w:numPr>
         <w:bidi w:val="0"/>
         <w:jc w:val="start"/>
-        <w:rPr/>
-      </w:pPr>
-      <w:r>
-        <w:rPr>
-          <w:rFonts w:ascii="Times New Roman" w:hAnsi="Times New Roman"/>
-          <w:b/>
-          <w:bCs/>
+        <w:rPr>
+          <w:lang w:val="pt-BR"/>
+        </w:rPr>
+      </w:pPr>
+      <w:r>
+        <w:rPr>
+          <w:rFonts w:ascii="Times New Roman" w:hAnsi="Times New Roman"/>
+          <w:b/>
+          <w:bCs/>
+          <w:lang w:val="pt-BR"/>
         </w:rPr>
         <w:t>Desenvolvedor Front-end (Voluntário)</w:t>
       </w:r>
       <w:r>
         <w:rPr>
           <w:rFonts w:ascii="Times New Roman" w:hAnsi="Times New Roman"/>
+          <w:lang w:val="pt-BR"/>
         </w:rPr>
         <w:t xml:space="preserve"> – FreeHelper | Ago/2025 – Set/2025 </w:t>
       </w:r>
@@ -948,12 +1300,13 @@
         <w:bidi w:val="0"/>
         <w:jc w:val="start"/>
         <w:rPr>
-          <w:rFonts w:ascii="Times New Roman" w:hAnsi="Times New Roman"/>
-        </w:rPr>
-      </w:pPr>
-      <w:r>
-        <w:rPr>
-          <w:rFonts w:ascii="Times New Roman" w:hAnsi="Times New Roman"/>
+          <w:lang w:val="pt-BR"/>
+        </w:rPr>
+      </w:pPr>
+      <w:r>
+        <w:rPr>
+          <w:rFonts w:ascii="Times New Roman" w:hAnsi="Times New Roman"/>
+          <w:lang w:val="pt-BR"/>
         </w:rPr>
         <w:tab/>
         <w:t>Principais responsabilidades:</w:t>
@@ -968,11 +1321,15 @@
         </w:numPr>
         <w:bidi w:val="0"/>
         <w:jc w:val="start"/>
-        <w:rPr/>
-      </w:pPr>
-      <w:r>
-        <w:rPr>
-          <w:rFonts w:ascii="Times New Roman" w:hAnsi="Times New Roman"/>
+        <w:rPr>
+          <w:rFonts w:ascii="Times New Roman" w:hAnsi="Times New Roman"/>
+          <w:lang w:val="pt-BR"/>
+        </w:rPr>
+      </w:pPr>
+      <w:r>
+        <w:rPr>
+          <w:rFonts w:ascii="Times New Roman" w:hAnsi="Times New Roman"/>
+          <w:lang w:val="pt-BR"/>
         </w:rPr>
         <w:t>Desenvolvimento completo do novo site institucional para a "Fundação de Amparo a Miséria Nacional".</w:t>
       </w:r>
@@ -987,12 +1344,13 @@
         <w:bidi w:val="0"/>
         <w:jc w:val="start"/>
         <w:rPr>
-          <w:rFonts w:ascii="Times New Roman" w:hAnsi="Times New Roman"/>
-        </w:rPr>
-      </w:pPr>
-      <w:r>
-        <w:rPr>
-          <w:rFonts w:ascii="Times New Roman" w:hAnsi="Times New Roman"/>
+          <w:lang w:val="pt-BR"/>
+        </w:rPr>
+      </w:pPr>
+      <w:r>
+        <w:rPr>
+          <w:rFonts w:ascii="Times New Roman" w:hAnsi="Times New Roman"/>
+          <w:lang w:val="pt-BR"/>
         </w:rPr>
         <w:t>Atuação direta em projeto voluntário de 60 horas, com foco em impacto social.</w:t>
       </w:r>
@@ -1004,11 +1362,13 @@
         <w:jc w:val="start"/>
         <w:rPr>
           <w:rFonts w:ascii="Times New Roman" w:hAnsi="Times New Roman"/>
-        </w:rPr>
-      </w:pPr>
-      <w:r>
-        <w:rPr>
-          <w:rFonts w:ascii="Times New Roman" w:hAnsi="Times New Roman"/>
+          <w:lang w:val="pt-BR"/>
+        </w:rPr>
+      </w:pPr>
+      <w:r>
+        <w:rPr>
+          <w:rFonts w:ascii="Times New Roman" w:hAnsi="Times New Roman"/>
+          <w:lang w:val="pt-BR"/>
         </w:rPr>
       </w:r>
     </w:p>
@@ -1021,19 +1381,23 @@
         </w:numPr>
         <w:bidi w:val="0"/>
         <w:jc w:val="start"/>
-        <w:rPr/>
-      </w:pPr>
-      <w:r>
-        <w:rPr>
-          <w:rFonts w:ascii="Times New Roman" w:hAnsi="Times New Roman"/>
-          <w:b/>
-          <w:bCs/>
+        <w:rPr>
+          <w:lang w:val="pt-BR"/>
+        </w:rPr>
+      </w:pPr>
+      <w:r>
+        <w:rPr>
+          <w:rFonts w:ascii="Times New Roman" w:hAnsi="Times New Roman"/>
+          <w:b/>
+          <w:bCs/>
+          <w:lang w:val="pt-BR"/>
         </w:rPr>
         <w:t>Instrutor (Voluntário)</w:t>
       </w:r>
       <w:r>
         <w:rPr>
           <w:rFonts w:ascii="Times New Roman" w:hAnsi="Times New Roman"/>
+          <w:lang w:val="pt-BR"/>
         </w:rPr>
         <w:t xml:space="preserve"> – Rede de Aplicação de Ciência e Tecnologia | Set/2022 – Mar/2023 </w:t>
       </w:r>
@@ -1044,12 +1408,13 @@
         <w:bidi w:val="0"/>
         <w:jc w:val="start"/>
         <w:rPr>
-          <w:rFonts w:ascii="Times New Roman" w:hAnsi="Times New Roman"/>
-        </w:rPr>
-      </w:pPr>
-      <w:r>
-        <w:rPr>
-          <w:rFonts w:ascii="Times New Roman" w:hAnsi="Times New Roman"/>
+          <w:lang w:val="pt-BR"/>
+        </w:rPr>
+      </w:pPr>
+      <w:r>
+        <w:rPr>
+          <w:rFonts w:ascii="Times New Roman" w:hAnsi="Times New Roman"/>
+          <w:lang w:val="pt-BR"/>
         </w:rPr>
         <w:tab/>
         <w:t>Principais responsabilidades:</w:t>
@@ -1064,11 +1429,14 @@
         </w:numPr>
         <w:bidi w:val="0"/>
         <w:jc w:val="start"/>
-        <w:rPr/>
-      </w:pPr>
-      <w:r>
-        <w:rPr>
-          <w:rFonts w:ascii="Times New Roman" w:hAnsi="Times New Roman"/>
+        <w:rPr>
+          <w:lang w:val="pt-BR"/>
+        </w:rPr>
+      </w:pPr>
+      <w:r>
+        <w:rPr>
+          <w:rFonts w:ascii="Times New Roman" w:hAnsi="Times New Roman"/>
+          <w:lang w:val="pt-BR"/>
         </w:rPr>
         <w:t xml:space="preserve">Atuação como instrutor voluntário em um curso de </w:t>
       </w:r>
@@ -1077,12 +1445,14 @@
           <w:rFonts w:ascii="Times New Roman" w:hAnsi="Times New Roman"/>
           <w:b/>
           <w:bCs/>
+          <w:lang w:val="pt-BR"/>
         </w:rPr>
         <w:t>Python</w:t>
       </w:r>
       <w:r>
         <w:rPr>
           <w:rFonts w:ascii="Times New Roman" w:hAnsi="Times New Roman"/>
+          <w:lang w:val="pt-BR"/>
         </w:rPr>
         <w:t xml:space="preserve"> voltado para alunos do ensino médio.</w:t>
       </w:r>
@@ -1097,12 +1467,13 @@
         <w:bidi w:val="0"/>
         <w:jc w:val="start"/>
         <w:rPr>
-          <w:rFonts w:ascii="Times New Roman" w:hAnsi="Times New Roman"/>
-        </w:rPr>
-      </w:pPr>
-      <w:r>
-        <w:rPr>
-          <w:rFonts w:ascii="Times New Roman" w:hAnsi="Times New Roman"/>
+          <w:lang w:val="pt-BR"/>
+        </w:rPr>
+      </w:pPr>
+      <w:r>
+        <w:rPr>
+          <w:rFonts w:ascii="Times New Roman" w:hAnsi="Times New Roman"/>
+          <w:lang w:val="pt-BR"/>
         </w:rPr>
         <w:t>Ensino de conceitos fundamentais de programação e acompanhamento individualizado do desenvolvimento dos estudantes.</w:t>
       </w:r>
@@ -1114,26 +1485,30 @@
         <w:jc w:val="start"/>
         <w:rPr>
           <w:rFonts w:ascii="Times New Roman" w:hAnsi="Times New Roman"/>
-        </w:rPr>
-      </w:pPr>
-      <w:r>
-        <w:rPr>
-          <w:rFonts w:ascii="Times New Roman" w:hAnsi="Times New Roman"/>
-        </w:rPr>
-      </w:r>
-    </w:p>
-    <w:p>
-      <w:pPr>
-        <w:pStyle w:val="Normal"/>
-        <w:bidi w:val="0"/>
-        <w:jc w:val="start"/>
-        <w:rPr>
-          <w:rFonts w:ascii="Times New Roman" w:hAnsi="Times New Roman"/>
-        </w:rPr>
-      </w:pPr>
-      <w:r>
-        <w:rPr>
-          <w:rFonts w:ascii="Times New Roman" w:hAnsi="Times New Roman"/>
+          <w:lang w:val="pt-BR"/>
+        </w:rPr>
+      </w:pPr>
+      <w:r>
+        <w:rPr>
+          <w:rFonts w:ascii="Times New Roman" w:hAnsi="Times New Roman"/>
+          <w:lang w:val="pt-BR"/>
+        </w:rPr>
+      </w:r>
+    </w:p>
+    <w:p>
+      <w:pPr>
+        <w:pStyle w:val="Normal"/>
+        <w:bidi w:val="0"/>
+        <w:jc w:val="start"/>
+        <w:rPr>
+          <w:rFonts w:ascii="Times New Roman" w:hAnsi="Times New Roman"/>
+          <w:lang w:val="pt-BR"/>
+        </w:rPr>
+      </w:pPr>
+      <w:r>
+        <w:rPr>
+          <w:rFonts w:ascii="Times New Roman" w:hAnsi="Times New Roman"/>
+          <w:lang w:val="pt-BR"/>
         </w:rPr>
       </w:r>
     </w:p>
@@ -1143,6 +1518,11 @@
         <w:bidi w:val="0"/>
         <w:spacing w:lineRule="auto" w:line="276"/>
         <w:jc w:val="start"/>
+        <w:rPr>
+          <w:lang w:val="pt-BR"/>
+        </w:rPr>
+      </w:pPr>
+      <w:r>
         <w:rPr>
           <w:rFonts w:ascii="Times New Roman" w:hAnsi="Times New Roman"/>
           <w:b/>
@@ -1150,16 +1530,7 @@
           <w:color w:val="2A6099"/>
           <w:sz w:val="28"/>
           <w:szCs w:val="28"/>
-        </w:rPr>
-      </w:pPr>
-      <w:r>
-        <w:rPr>
-          <w:rFonts w:ascii="Times New Roman" w:hAnsi="Times New Roman"/>
-          <w:b/>
-          <w:bCs/>
-          <w:color w:val="2A6099"/>
-          <w:sz w:val="28"/>
-          <w:szCs w:val="28"/>
+          <w:lang w:val="pt-BR"/>
         </w:rPr>
         <w:t>EXPERIÊNCIAS RELEVANTES</w:t>
       </w:r>
@@ -1175,28 +1546,24 @@
         <w:spacing w:lineRule="auto" w:line="276"/>
         <w:jc w:val="start"/>
         <w:rPr>
-          <w:rFonts w:ascii="Times New Roman" w:hAnsi="Times New Roman"/>
-        </w:rPr>
-      </w:pPr>
-      <w:r>
-        <w:rPr>
-          <w:rFonts w:ascii="Times New Roman" w:hAnsi="Times New Roman"/>
-          <w:b/>
-          <w:bCs/>
+          <w:lang w:val="pt-BR"/>
+        </w:rPr>
+      </w:pPr>
+      <w:r>
+        <w:rPr>
+          <w:rFonts w:ascii="Times New Roman" w:hAnsi="Times New Roman"/>
+          <w:b/>
+          <w:bCs/>
+          <w:lang w:val="pt-BR"/>
         </w:rPr>
         <w:t>Projeto Conectando Leitores</w:t>
       </w:r>
       <w:r>
         <w:rPr>
           <w:rFonts w:ascii="Times New Roman" w:hAnsi="Times New Roman"/>
-        </w:rPr>
-        <w:t xml:space="preserve"> – QaCoders Academy | Fev/2025 – </w:t>
-      </w:r>
-      <w:r>
-        <w:rPr>
-          <w:rFonts w:ascii="Times New Roman" w:hAnsi="Times New Roman"/>
-        </w:rPr>
-        <w:t>Dez/2025</w:t>
+          <w:lang w:val="pt-BR"/>
+        </w:rPr>
+        <w:t xml:space="preserve"> – QaCoders Academy | Fev/2025 – Dez/2025</w:t>
       </w:r>
     </w:p>
     <w:p>
@@ -1209,12 +1576,13 @@
         <w:bidi w:val="0"/>
         <w:jc w:val="start"/>
         <w:rPr>
-          <w:rFonts w:ascii="Times New Roman" w:hAnsi="Times New Roman"/>
-        </w:rPr>
-      </w:pPr>
-      <w:r>
-        <w:rPr>
-          <w:rFonts w:ascii="Times New Roman" w:hAnsi="Times New Roman"/>
+          <w:lang w:val="pt-BR"/>
+        </w:rPr>
+      </w:pPr>
+      <w:r>
+        <w:rPr>
+          <w:rFonts w:ascii="Times New Roman" w:hAnsi="Times New Roman"/>
+          <w:lang w:val="pt-BR"/>
         </w:rPr>
         <w:t>Atuação em uma squad multidisciplinar (</w:t>
       </w:r>
@@ -1223,12 +1591,14 @@
           <w:rFonts w:ascii="Times New Roman" w:hAnsi="Times New Roman"/>
           <w:b/>
           <w:bCs/>
+          <w:lang w:val="pt-BR"/>
         </w:rPr>
         <w:t>Product</w:t>
       </w:r>
       <w:r>
         <w:rPr>
           <w:rFonts w:ascii="Times New Roman" w:hAnsi="Times New Roman"/>
+          <w:lang w:val="pt-BR"/>
         </w:rPr>
         <w:t xml:space="preserve">, </w:t>
       </w:r>
@@ -1237,12 +1607,14 @@
           <w:rFonts w:ascii="Times New Roman" w:hAnsi="Times New Roman"/>
           <w:b/>
           <w:bCs/>
+          <w:lang w:val="pt-BR"/>
         </w:rPr>
         <w:t>UX</w:t>
       </w:r>
       <w:r>
         <w:rPr>
           <w:rFonts w:ascii="Times New Roman" w:hAnsi="Times New Roman"/>
+          <w:lang w:val="pt-BR"/>
         </w:rPr>
         <w:t xml:space="preserve">, </w:t>
       </w:r>
@@ -1251,12 +1623,14 @@
           <w:rFonts w:ascii="Times New Roman" w:hAnsi="Times New Roman"/>
           <w:b/>
           <w:bCs/>
+          <w:lang w:val="pt-BR"/>
         </w:rPr>
         <w:t>QA</w:t>
       </w:r>
       <w:r>
         <w:rPr>
           <w:rFonts w:ascii="Times New Roman" w:hAnsi="Times New Roman"/>
+          <w:lang w:val="pt-BR"/>
         </w:rPr>
         <w:t xml:space="preserve">, </w:t>
       </w:r>
@@ -1265,12 +1639,14 @@
           <w:rFonts w:ascii="Times New Roman" w:hAnsi="Times New Roman"/>
           <w:b/>
           <w:bCs/>
+          <w:lang w:val="pt-BR"/>
         </w:rPr>
         <w:t>Backend</w:t>
       </w:r>
       <w:r>
         <w:rPr>
           <w:rFonts w:ascii="Times New Roman" w:hAnsi="Times New Roman"/>
+          <w:lang w:val="pt-BR"/>
         </w:rPr>
         <w:t xml:space="preserve"> e </w:t>
       </w:r>
@@ -1279,12 +1655,14 @@
           <w:rFonts w:ascii="Times New Roman" w:hAnsi="Times New Roman"/>
           <w:b/>
           <w:bCs/>
+          <w:lang w:val="pt-BR"/>
         </w:rPr>
         <w:t>DevOps</w:t>
       </w:r>
       <w:r>
         <w:rPr>
           <w:rFonts w:ascii="Times New Roman" w:hAnsi="Times New Roman"/>
+          <w:lang w:val="pt-BR"/>
         </w:rPr>
         <w:t xml:space="preserve">) para a construção de interfaces escaláveis com </w:t>
       </w:r>
@@ -1293,12 +1671,14 @@
           <w:rFonts w:ascii="Times New Roman" w:hAnsi="Times New Roman"/>
           <w:b/>
           <w:bCs/>
+          <w:lang w:val="pt-BR"/>
         </w:rPr>
         <w:t>Next.js</w:t>
       </w:r>
       <w:r>
         <w:rPr>
           <w:rFonts w:ascii="Times New Roman" w:hAnsi="Times New Roman"/>
+          <w:lang w:val="pt-BR"/>
         </w:rPr>
         <w:t>, desenvolvendo uma plataforma completa de biblioteca virtual em ambiente simulado de mercado.</w:t>
       </w:r>
@@ -1310,11 +1690,13 @@
         <w:jc w:val="start"/>
         <w:rPr>
           <w:rFonts w:ascii="Times New Roman" w:hAnsi="Times New Roman"/>
-        </w:rPr>
-      </w:pPr>
-      <w:r>
-        <w:rPr>
-          <w:rFonts w:ascii="Times New Roman" w:hAnsi="Times New Roman"/>
+          <w:lang w:val="pt-BR"/>
+        </w:rPr>
+      </w:pPr>
+      <w:r>
+        <w:rPr>
+          <w:rFonts w:ascii="Times New Roman" w:hAnsi="Times New Roman"/>
+          <w:lang w:val="pt-BR"/>
         </w:rPr>
       </w:r>
     </w:p>
@@ -1328,19 +1710,23 @@
         <w:bidi w:val="0"/>
         <w:spacing w:lineRule="auto" w:line="276"/>
         <w:jc w:val="start"/>
-        <w:rPr/>
-      </w:pPr>
-      <w:r>
-        <w:rPr>
-          <w:rFonts w:ascii="Times New Roman" w:hAnsi="Times New Roman"/>
-          <w:b/>
-          <w:bCs/>
+        <w:rPr>
+          <w:lang w:val="pt-BR"/>
+        </w:rPr>
+      </w:pPr>
+      <w:r>
+        <w:rPr>
+          <w:rFonts w:ascii="Times New Roman" w:hAnsi="Times New Roman"/>
+          <w:b/>
+          <w:bCs/>
+          <w:lang w:val="pt-BR"/>
         </w:rPr>
         <w:t>Projeto Finantrack (Fullstack)</w:t>
       </w:r>
       <w:r>
         <w:rPr>
           <w:rFonts w:ascii="Times New Roman" w:hAnsi="Times New Roman"/>
+          <w:lang w:val="pt-BR"/>
         </w:rPr>
         <w:t xml:space="preserve"> – Projeto Pessoal | Jun/2025 – Ago/2025</w:t>
       </w:r>
@@ -1355,12 +1741,13 @@
         <w:bidi w:val="0"/>
         <w:jc w:val="start"/>
         <w:rPr>
-          <w:rFonts w:ascii="Times New Roman" w:hAnsi="Times New Roman"/>
-        </w:rPr>
-      </w:pPr>
-      <w:r>
-        <w:rPr>
-          <w:rFonts w:ascii="Times New Roman" w:hAnsi="Times New Roman"/>
+          <w:lang w:val="pt-BR"/>
+        </w:rPr>
+      </w:pPr>
+      <w:r>
+        <w:rPr>
+          <w:rFonts w:ascii="Times New Roman" w:hAnsi="Times New Roman"/>
+          <w:lang w:val="pt-BR"/>
         </w:rPr>
         <w:t xml:space="preserve">Desenvolvimento do </w:t>
       </w:r>
@@ -1369,12 +1756,14 @@
           <w:rFonts w:ascii="Times New Roman" w:hAnsi="Times New Roman"/>
           <w:b/>
           <w:bCs/>
+          <w:lang w:val="pt-BR"/>
         </w:rPr>
         <w:t>Frontend</w:t>
       </w:r>
       <w:r>
         <w:rPr>
           <w:rFonts w:ascii="Times New Roman" w:hAnsi="Times New Roman"/>
+          <w:lang w:val="pt-BR"/>
         </w:rPr>
         <w:t xml:space="preserve"> utilizando interface reativa e moderna com </w:t>
       </w:r>
@@ -1383,12 +1772,14 @@
           <w:rFonts w:ascii="Times New Roman" w:hAnsi="Times New Roman"/>
           <w:b/>
           <w:bCs/>
+          <w:lang w:val="pt-BR"/>
         </w:rPr>
         <w:t>Next.js</w:t>
       </w:r>
       <w:r>
         <w:rPr>
           <w:rFonts w:ascii="Times New Roman" w:hAnsi="Times New Roman"/>
+          <w:lang w:val="pt-BR"/>
         </w:rPr>
         <w:t xml:space="preserve">, </w:t>
       </w:r>
@@ -1397,12 +1788,14 @@
           <w:rFonts w:ascii="Times New Roman" w:hAnsi="Times New Roman"/>
           <w:b/>
           <w:bCs/>
+          <w:lang w:val="pt-BR"/>
         </w:rPr>
         <w:t>React</w:t>
       </w:r>
       <w:r>
         <w:rPr>
           <w:rFonts w:ascii="Times New Roman" w:hAnsi="Times New Roman"/>
+          <w:lang w:val="pt-BR"/>
         </w:rPr>
         <w:t xml:space="preserve">, </w:t>
       </w:r>
@@ -1411,12 +1804,14 @@
           <w:rFonts w:ascii="Times New Roman" w:hAnsi="Times New Roman"/>
           <w:b/>
           <w:bCs/>
+          <w:lang w:val="pt-BR"/>
         </w:rPr>
         <w:t>TypeScript</w:t>
       </w:r>
       <w:r>
         <w:rPr>
           <w:rFonts w:ascii="Times New Roman" w:hAnsi="Times New Roman"/>
+          <w:lang w:val="pt-BR"/>
         </w:rPr>
         <w:t xml:space="preserve"> e </w:t>
       </w:r>
@@ -1425,12 +1820,14 @@
           <w:rFonts w:ascii="Times New Roman" w:hAnsi="Times New Roman"/>
           <w:b/>
           <w:bCs/>
+          <w:lang w:val="pt-BR"/>
         </w:rPr>
         <w:t>Tailwind</w:t>
       </w:r>
       <w:r>
         <w:rPr>
           <w:rFonts w:ascii="Times New Roman" w:hAnsi="Times New Roman"/>
+          <w:lang w:val="pt-BR"/>
         </w:rPr>
         <w:t xml:space="preserve"> </w:t>
       </w:r>
@@ -1439,12 +1836,14 @@
           <w:rFonts w:ascii="Times New Roman" w:hAnsi="Times New Roman"/>
           <w:b/>
           <w:bCs/>
+          <w:lang w:val="pt-BR"/>
         </w:rPr>
         <w:t>CSS</w:t>
       </w:r>
       <w:r>
         <w:rPr>
           <w:rFonts w:ascii="Times New Roman" w:hAnsi="Times New Roman"/>
+          <w:lang w:val="pt-BR"/>
         </w:rPr>
         <w:t xml:space="preserve">. Construção simultânea do </w:t>
       </w:r>
@@ -1453,12 +1852,14 @@
           <w:rFonts w:ascii="Times New Roman" w:hAnsi="Times New Roman"/>
           <w:b/>
           <w:bCs/>
+          <w:lang w:val="pt-BR"/>
         </w:rPr>
         <w:t>Backend</w:t>
       </w:r>
       <w:r>
         <w:rPr>
           <w:rFonts w:ascii="Times New Roman" w:hAnsi="Times New Roman"/>
+          <w:lang w:val="pt-BR"/>
         </w:rPr>
         <w:t xml:space="preserve"> com </w:t>
       </w:r>
@@ -1467,12 +1868,14 @@
           <w:rFonts w:ascii="Times New Roman" w:hAnsi="Times New Roman"/>
           <w:b/>
           <w:bCs/>
+          <w:lang w:val="pt-BR"/>
         </w:rPr>
         <w:t>API</w:t>
       </w:r>
       <w:r>
         <w:rPr>
           <w:rFonts w:ascii="Times New Roman" w:hAnsi="Times New Roman"/>
+          <w:lang w:val="pt-BR"/>
         </w:rPr>
         <w:t xml:space="preserve"> </w:t>
       </w:r>
@@ -1481,12 +1884,14 @@
           <w:rFonts w:ascii="Times New Roman" w:hAnsi="Times New Roman"/>
           <w:b/>
           <w:bCs/>
+          <w:lang w:val="pt-BR"/>
         </w:rPr>
         <w:t>RESTful</w:t>
       </w:r>
       <w:r>
         <w:rPr>
           <w:rFonts w:ascii="Times New Roman" w:hAnsi="Times New Roman"/>
+          <w:lang w:val="pt-BR"/>
         </w:rPr>
         <w:t xml:space="preserve"> segura baseada em </w:t>
       </w:r>
@@ -1495,12 +1900,14 @@
           <w:rFonts w:ascii="Times New Roman" w:hAnsi="Times New Roman"/>
           <w:b/>
           <w:bCs/>
+          <w:lang w:val="pt-BR"/>
         </w:rPr>
         <w:t>Node.js</w:t>
       </w:r>
       <w:r>
         <w:rPr>
           <w:rFonts w:ascii="Times New Roman" w:hAnsi="Times New Roman"/>
+          <w:lang w:val="pt-BR"/>
         </w:rPr>
         <w:t xml:space="preserve">, </w:t>
       </w:r>
@@ -1509,12 +1916,14 @@
           <w:rFonts w:ascii="Times New Roman" w:hAnsi="Times New Roman"/>
           <w:b/>
           <w:bCs/>
+          <w:lang w:val="pt-BR"/>
         </w:rPr>
         <w:t>Express</w:t>
       </w:r>
       <w:r>
         <w:rPr>
           <w:rFonts w:ascii="Times New Roman" w:hAnsi="Times New Roman"/>
+          <w:lang w:val="pt-BR"/>
         </w:rPr>
         <w:t xml:space="preserve">, </w:t>
       </w:r>
@@ -1523,12 +1932,14 @@
           <w:rFonts w:ascii="Times New Roman" w:hAnsi="Times New Roman"/>
           <w:b/>
           <w:bCs/>
+          <w:lang w:val="pt-BR"/>
         </w:rPr>
         <w:t>Prisma</w:t>
       </w:r>
       <w:r>
         <w:rPr>
           <w:rFonts w:ascii="Times New Roman" w:hAnsi="Times New Roman"/>
+          <w:lang w:val="pt-BR"/>
         </w:rPr>
         <w:t xml:space="preserve">, </w:t>
       </w:r>
@@ -1537,12 +1948,14 @@
           <w:rFonts w:ascii="Times New Roman" w:hAnsi="Times New Roman"/>
           <w:b/>
           <w:bCs/>
+          <w:lang w:val="pt-BR"/>
         </w:rPr>
         <w:t>PostgreSQL</w:t>
       </w:r>
       <w:r>
         <w:rPr>
           <w:rFonts w:ascii="Times New Roman" w:hAnsi="Times New Roman"/>
+          <w:lang w:val="pt-BR"/>
         </w:rPr>
         <w:t xml:space="preserve"> e </w:t>
       </w:r>
@@ -1551,12 +1964,14 @@
           <w:rFonts w:ascii="Times New Roman" w:hAnsi="Times New Roman"/>
           <w:b/>
           <w:bCs/>
+          <w:lang w:val="pt-BR"/>
         </w:rPr>
         <w:t>autenticação</w:t>
       </w:r>
       <w:r>
         <w:rPr>
           <w:rFonts w:ascii="Times New Roman" w:hAnsi="Times New Roman"/>
+          <w:lang w:val="pt-BR"/>
         </w:rPr>
         <w:t xml:space="preserve"> </w:t>
       </w:r>
@@ -1565,6 +1980,7 @@
           <w:rFonts w:ascii="Times New Roman" w:hAnsi="Times New Roman"/>
           <w:b/>
           <w:bCs/>
+          <w:lang w:val="pt-BR"/>
         </w:rPr>
         <w:t>JWT</w:t>
       </w:r>
@@ -1573,6 +1989,7 @@
           <w:rFonts w:ascii="Times New Roman" w:hAnsi="Times New Roman"/>
           <w:b w:val="false"/>
           <w:bCs w:val="false"/>
+          <w:lang w:val="pt-BR"/>
         </w:rPr>
         <w:t>.</w:t>
       </w:r>
@@ -1584,11 +2001,13 @@
         <w:jc w:val="start"/>
         <w:rPr>
           <w:rFonts w:ascii="Times New Roman" w:hAnsi="Times New Roman"/>
-        </w:rPr>
-      </w:pPr>
-      <w:r>
-        <w:rPr>
-          <w:rFonts w:ascii="Times New Roman" w:hAnsi="Times New Roman"/>
+          <w:lang w:val="pt-BR"/>
+        </w:rPr>
+      </w:pPr>
+      <w:r>
+        <w:rPr>
+          <w:rFonts w:ascii="Times New Roman" w:hAnsi="Times New Roman"/>
+          <w:lang w:val="pt-BR"/>
         </w:rPr>
       </w:r>
     </w:p>
@@ -1602,33 +2021,25 @@
         <w:bidi w:val="0"/>
         <w:spacing w:lineRule="auto" w:line="276"/>
         <w:jc w:val="start"/>
-        <w:rPr/>
-      </w:pPr>
-      <w:r>
-        <w:rPr>
-          <w:rFonts w:ascii="Times New Roman" w:hAnsi="Times New Roman"/>
-          <w:b/>
-          <w:bCs/>
+        <w:rPr>
+          <w:lang w:val="pt-BR"/>
+        </w:rPr>
+      </w:pPr>
+      <w:r>
+        <w:rPr>
+          <w:rFonts w:ascii="Times New Roman" w:hAnsi="Times New Roman"/>
+          <w:b/>
+          <w:bCs/>
+          <w:lang w:val="pt-BR"/>
         </w:rPr>
         <w:t>Portfólio Dr. Vinicius Fonseca</w:t>
       </w:r>
       <w:r>
         <w:rPr>
           <w:rFonts w:ascii="Times New Roman" w:hAnsi="Times New Roman"/>
-        </w:rPr>
-        <w:t xml:space="preserve"> – </w:t>
-      </w:r>
-      <w:r>
-        <w:rPr>
-          <w:rFonts w:ascii="Times New Roman" w:hAnsi="Times New Roman"/>
-        </w:rPr>
-        <w:t>Freelancer</w:t>
-      </w:r>
-      <w:r>
-        <w:rPr>
-          <w:rFonts w:ascii="Times New Roman" w:hAnsi="Times New Roman"/>
-        </w:rPr>
-        <w:t xml:space="preserve"> | Ago/2025</w:t>
+          <w:lang w:val="pt-BR"/>
+        </w:rPr>
+        <w:t xml:space="preserve"> – Freelancer | Ago/2025</w:t>
       </w:r>
     </w:p>
     <w:p>
@@ -1641,12 +2052,13 @@
         <w:bidi w:val="0"/>
         <w:jc w:val="start"/>
         <w:rPr>
-          <w:rFonts w:ascii="Times New Roman" w:hAnsi="Times New Roman"/>
-        </w:rPr>
-      </w:pPr>
-      <w:r>
-        <w:rPr>
-          <w:rFonts w:ascii="Times New Roman" w:hAnsi="Times New Roman"/>
+          <w:lang w:val="pt-BR"/>
+        </w:rPr>
+      </w:pPr>
+      <w:r>
+        <w:rPr>
+          <w:rFonts w:ascii="Times New Roman" w:hAnsi="Times New Roman"/>
+          <w:lang w:val="pt-BR"/>
         </w:rPr>
         <w:t xml:space="preserve">Desenvolvimento de site e portfólio para profissional da área veterinária, utilizando </w:t>
       </w:r>
@@ -1655,12 +2067,14 @@
           <w:rFonts w:ascii="Times New Roman" w:hAnsi="Times New Roman"/>
           <w:b/>
           <w:bCs/>
+          <w:lang w:val="pt-BR"/>
         </w:rPr>
         <w:t>Next.js</w:t>
       </w:r>
       <w:r>
         <w:rPr>
           <w:rFonts w:ascii="Times New Roman" w:hAnsi="Times New Roman"/>
+          <w:lang w:val="pt-BR"/>
         </w:rPr>
         <w:t xml:space="preserve">, </w:t>
       </w:r>
@@ -1669,12 +2083,14 @@
           <w:rFonts w:ascii="Times New Roman" w:hAnsi="Times New Roman"/>
           <w:b/>
           <w:bCs/>
+          <w:lang w:val="pt-BR"/>
         </w:rPr>
         <w:t>Tailwind CSS</w:t>
       </w:r>
       <w:r>
         <w:rPr>
           <w:rFonts w:ascii="Times New Roman" w:hAnsi="Times New Roman"/>
+          <w:lang w:val="pt-BR"/>
         </w:rPr>
         <w:t xml:space="preserve"> e </w:t>
       </w:r>
@@ -1683,12 +2099,14 @@
           <w:rFonts w:ascii="Times New Roman" w:hAnsi="Times New Roman"/>
           <w:b/>
           <w:bCs/>
+          <w:lang w:val="pt-BR"/>
         </w:rPr>
         <w:t>Sanity.io</w:t>
       </w:r>
       <w:r>
         <w:rPr>
           <w:rFonts w:ascii="Times New Roman" w:hAnsi="Times New Roman"/>
+          <w:lang w:val="pt-BR"/>
         </w:rPr>
         <w:t xml:space="preserve"> como </w:t>
       </w:r>
@@ -1697,12 +2115,14 @@
           <w:rFonts w:ascii="Times New Roman" w:hAnsi="Times New Roman"/>
           <w:b/>
           <w:bCs/>
+          <w:lang w:val="pt-BR"/>
         </w:rPr>
         <w:t>CMS</w:t>
       </w:r>
       <w:r>
         <w:rPr>
           <w:rFonts w:ascii="Times New Roman" w:hAnsi="Times New Roman"/>
+          <w:lang w:val="pt-BR"/>
         </w:rPr>
         <w:t xml:space="preserve"> </w:t>
       </w:r>
@@ -1711,12 +2131,14 @@
           <w:rFonts w:ascii="Times New Roman" w:hAnsi="Times New Roman"/>
           <w:b/>
           <w:bCs/>
+          <w:lang w:val="pt-BR"/>
         </w:rPr>
         <w:t>headless</w:t>
       </w:r>
       <w:r>
         <w:rPr>
           <w:rFonts w:ascii="Times New Roman" w:hAnsi="Times New Roman"/>
+          <w:lang w:val="pt-BR"/>
         </w:rPr>
         <w:t xml:space="preserve"> para o gerenciamento dinâmico de conteúdo.</w:t>
       </w:r>
@@ -1728,11 +2150,13 @@
         <w:jc w:val="start"/>
         <w:rPr>
           <w:rFonts w:ascii="Times New Roman" w:hAnsi="Times New Roman"/>
-        </w:rPr>
-      </w:pPr>
-      <w:r>
-        <w:rPr>
-          <w:rFonts w:ascii="Times New Roman" w:hAnsi="Times New Roman"/>
+          <w:lang w:val="pt-BR"/>
+        </w:rPr>
+      </w:pPr>
+      <w:r>
+        <w:rPr>
+          <w:rFonts w:ascii="Times New Roman" w:hAnsi="Times New Roman"/>
+          <w:lang w:val="pt-BR"/>
         </w:rPr>
       </w:r>
     </w:p>
@@ -1746,33 +2170,25 @@
         <w:bidi w:val="0"/>
         <w:spacing w:lineRule="auto" w:line="276"/>
         <w:jc w:val="start"/>
-        <w:rPr/>
-      </w:pPr>
-      <w:r>
-        <w:rPr>
-          <w:rFonts w:ascii="Times New Roman" w:hAnsi="Times New Roman"/>
-          <w:b/>
-          <w:bCs/>
+        <w:rPr>
+          <w:lang w:val="pt-BR"/>
+        </w:rPr>
+      </w:pPr>
+      <w:r>
+        <w:rPr>
+          <w:rFonts w:ascii="Times New Roman" w:hAnsi="Times New Roman"/>
+          <w:b/>
+          <w:bCs/>
+          <w:lang w:val="pt-BR"/>
         </w:rPr>
         <w:t>Convite Digital Interativo</w:t>
       </w:r>
       <w:r>
         <w:rPr>
           <w:rFonts w:ascii="Times New Roman" w:hAnsi="Times New Roman"/>
-        </w:rPr>
-        <w:t xml:space="preserve"> – </w:t>
-      </w:r>
-      <w:r>
-        <w:rPr>
-          <w:rFonts w:ascii="Times New Roman" w:hAnsi="Times New Roman"/>
-        </w:rPr>
-        <w:t>Freelancer</w:t>
-      </w:r>
-      <w:r>
-        <w:rPr>
-          <w:rFonts w:ascii="Times New Roman" w:hAnsi="Times New Roman"/>
-        </w:rPr>
-        <w:t xml:space="preserve"> | Jul/2025</w:t>
+          <w:lang w:val="pt-BR"/>
+        </w:rPr>
+        <w:t xml:space="preserve"> – Freelancer | Jul/2025</w:t>
       </w:r>
     </w:p>
     <w:p>
@@ -1785,12 +2201,13 @@
         <w:bidi w:val="0"/>
         <w:jc w:val="start"/>
         <w:rPr>
-          <w:rFonts w:ascii="Times New Roman" w:hAnsi="Times New Roman"/>
-        </w:rPr>
-      </w:pPr>
-      <w:r>
-        <w:rPr>
-          <w:rFonts w:ascii="Times New Roman" w:hAnsi="Times New Roman"/>
+          <w:lang w:val="pt-BR"/>
+        </w:rPr>
+      </w:pPr>
+      <w:r>
+        <w:rPr>
+          <w:rFonts w:ascii="Times New Roman" w:hAnsi="Times New Roman"/>
+          <w:lang w:val="pt-BR"/>
         </w:rPr>
         <w:t xml:space="preserve">Construção de um convite de casamento digital, interativo e elegante, utilizando </w:t>
       </w:r>
@@ -1799,12 +2216,14 @@
           <w:rFonts w:ascii="Times New Roman" w:hAnsi="Times New Roman"/>
           <w:b/>
           <w:bCs/>
+          <w:lang w:val="pt-BR"/>
         </w:rPr>
         <w:t>Vue</w:t>
       </w:r>
       <w:r>
         <w:rPr>
           <w:rFonts w:ascii="Times New Roman" w:hAnsi="Times New Roman"/>
+          <w:lang w:val="pt-BR"/>
         </w:rPr>
         <w:t xml:space="preserve">, </w:t>
       </w:r>
@@ -1813,12 +2232,14 @@
           <w:rFonts w:ascii="Times New Roman" w:hAnsi="Times New Roman"/>
           <w:b/>
           <w:bCs/>
+          <w:lang w:val="pt-BR"/>
         </w:rPr>
         <w:t>TypeScript</w:t>
       </w:r>
       <w:r>
         <w:rPr>
           <w:rFonts w:ascii="Times New Roman" w:hAnsi="Times New Roman"/>
+          <w:lang w:val="pt-BR"/>
         </w:rPr>
         <w:t xml:space="preserve"> e </w:t>
       </w:r>
@@ -1827,12 +2248,14 @@
           <w:rFonts w:ascii="Times New Roman" w:hAnsi="Times New Roman"/>
           <w:b/>
           <w:bCs/>
+          <w:lang w:val="pt-BR"/>
         </w:rPr>
         <w:t>Vite</w:t>
       </w:r>
       <w:r>
         <w:rPr>
           <w:rFonts w:ascii="Times New Roman" w:hAnsi="Times New Roman"/>
+          <w:lang w:val="pt-BR"/>
         </w:rPr>
         <w:t>. O sistema inclui confirmação de presença (</w:t>
       </w:r>
@@ -1841,12 +2264,14 @@
           <w:rFonts w:ascii="Times New Roman" w:hAnsi="Times New Roman"/>
           <w:b/>
           <w:bCs/>
+          <w:lang w:val="pt-BR"/>
         </w:rPr>
         <w:t>RSVP</w:t>
       </w:r>
       <w:r>
         <w:rPr>
           <w:rFonts w:ascii="Times New Roman" w:hAnsi="Times New Roman"/>
+          <w:lang w:val="pt-BR"/>
         </w:rPr>
         <w:t xml:space="preserve">) via integração com </w:t>
       </w:r>
@@ -1855,12 +2280,14 @@
           <w:rFonts w:ascii="Times New Roman" w:hAnsi="Times New Roman"/>
           <w:b/>
           <w:bCs/>
+          <w:lang w:val="pt-BR"/>
         </w:rPr>
         <w:t>Google Forms</w:t>
       </w:r>
       <w:r>
         <w:rPr>
           <w:rFonts w:ascii="Times New Roman" w:hAnsi="Times New Roman"/>
+          <w:lang w:val="pt-BR"/>
         </w:rPr>
         <w:t xml:space="preserve"> e um sistema de presentes com geração de </w:t>
       </w:r>
@@ -1869,12 +2296,14 @@
           <w:rFonts w:ascii="Times New Roman" w:hAnsi="Times New Roman"/>
           <w:b/>
           <w:bCs/>
+          <w:lang w:val="pt-BR"/>
         </w:rPr>
         <w:t>PIX</w:t>
       </w:r>
       <w:r>
         <w:rPr>
           <w:rFonts w:ascii="Times New Roman" w:hAnsi="Times New Roman"/>
+          <w:lang w:val="pt-BR"/>
         </w:rPr>
         <w:t xml:space="preserve"> </w:t>
       </w:r>
@@ -1883,12 +2312,14 @@
           <w:rFonts w:ascii="Times New Roman" w:hAnsi="Times New Roman"/>
           <w:b/>
           <w:bCs/>
+          <w:lang w:val="pt-BR"/>
         </w:rPr>
         <w:t>dinâmico</w:t>
       </w:r>
       <w:r>
         <w:rPr>
           <w:rFonts w:ascii="Times New Roman" w:hAnsi="Times New Roman"/>
+          <w:lang w:val="pt-BR"/>
         </w:rPr>
         <w:t>.</w:t>
       </w:r>
@@ -1900,26 +2331,30 @@
         <w:jc w:val="start"/>
         <w:rPr>
           <w:rFonts w:ascii="Times New Roman" w:hAnsi="Times New Roman"/>
-        </w:rPr>
-      </w:pPr>
-      <w:r>
-        <w:rPr>
-          <w:rFonts w:ascii="Times New Roman" w:hAnsi="Times New Roman"/>
-        </w:rPr>
-      </w:r>
-    </w:p>
-    <w:p>
-      <w:pPr>
-        <w:pStyle w:val="Normal"/>
-        <w:bidi w:val="0"/>
-        <w:jc w:val="start"/>
-        <w:rPr>
-          <w:rFonts w:ascii="Times New Roman" w:hAnsi="Times New Roman"/>
-        </w:rPr>
-      </w:pPr>
-      <w:r>
-        <w:rPr>
-          <w:rFonts w:ascii="Times New Roman" w:hAnsi="Times New Roman"/>
+          <w:lang w:val="pt-BR"/>
+        </w:rPr>
+      </w:pPr>
+      <w:r>
+        <w:rPr>
+          <w:rFonts w:ascii="Times New Roman" w:hAnsi="Times New Roman"/>
+          <w:lang w:val="pt-BR"/>
+        </w:rPr>
+      </w:r>
+    </w:p>
+    <w:p>
+      <w:pPr>
+        <w:pStyle w:val="Normal"/>
+        <w:bidi w:val="0"/>
+        <w:jc w:val="start"/>
+        <w:rPr>
+          <w:rFonts w:ascii="Times New Roman" w:hAnsi="Times New Roman"/>
+          <w:lang w:val="pt-BR"/>
+        </w:rPr>
+      </w:pPr>
+      <w:r>
+        <w:rPr>
+          <w:rFonts w:ascii="Times New Roman" w:hAnsi="Times New Roman"/>
+          <w:lang w:val="pt-BR"/>
         </w:rPr>
       </w:r>
     </w:p>
@@ -1929,6 +2364,11 @@
         <w:bidi w:val="0"/>
         <w:spacing w:lineRule="auto" w:line="276"/>
         <w:jc w:val="start"/>
+        <w:rPr>
+          <w:lang w:val="pt-BR"/>
+        </w:rPr>
+      </w:pPr>
+      <w:r>
         <w:rPr>
           <w:rFonts w:ascii="Times New Roman" w:hAnsi="Times New Roman"/>
           <w:b/>
@@ -1936,16 +2376,7 @@
           <w:color w:val="2A6099"/>
           <w:sz w:val="28"/>
           <w:szCs w:val="28"/>
-        </w:rPr>
-      </w:pPr>
-      <w:r>
-        <w:rPr>
-          <w:rFonts w:ascii="Times New Roman" w:hAnsi="Times New Roman"/>
-          <w:b/>
-          <w:bCs/>
-          <w:color w:val="2A6099"/>
-          <w:sz w:val="28"/>
-          <w:szCs w:val="28"/>
+          <w:lang w:val="pt-BR"/>
         </w:rPr>
         <w:t>IDIOMAS</w:t>
       </w:r>
@@ -1959,19 +2390,23 @@
         </w:numPr>
         <w:bidi w:val="0"/>
         <w:jc w:val="start"/>
-        <w:rPr/>
-      </w:pPr>
-      <w:r>
-        <w:rPr>
-          <w:rFonts w:ascii="Times New Roman" w:hAnsi="Times New Roman"/>
-          <w:b/>
-          <w:bCs/>
+        <w:rPr>
+          <w:lang w:val="pt-BR"/>
+        </w:rPr>
+      </w:pPr>
+      <w:r>
+        <w:rPr>
+          <w:rFonts w:ascii="Times New Roman" w:hAnsi="Times New Roman"/>
+          <w:b/>
+          <w:bCs/>
+          <w:lang w:val="pt-BR"/>
         </w:rPr>
         <w:t>Inglês</w:t>
       </w:r>
       <w:r>
         <w:rPr>
           <w:rFonts w:ascii="Times New Roman" w:hAnsi="Times New Roman"/>
+          <w:lang w:val="pt-BR"/>
         </w:rPr>
         <w:t xml:space="preserve"> – Intermediário, com foco em leitura e escrita técnica</w:t>
       </w:r>
@@ -1983,26 +2418,30 @@
         <w:jc w:val="start"/>
         <w:rPr>
           <w:rFonts w:ascii="Times New Roman" w:hAnsi="Times New Roman"/>
-        </w:rPr>
-      </w:pPr>
-      <w:r>
-        <w:rPr>
-          <w:rFonts w:ascii="Times New Roman" w:hAnsi="Times New Roman"/>
-        </w:rPr>
-      </w:r>
-    </w:p>
-    <w:p>
-      <w:pPr>
-        <w:pStyle w:val="Normal"/>
-        <w:bidi w:val="0"/>
-        <w:jc w:val="start"/>
-        <w:rPr>
-          <w:rFonts w:ascii="Times New Roman" w:hAnsi="Times New Roman"/>
-        </w:rPr>
-      </w:pPr>
-      <w:r>
-        <w:rPr>
-          <w:rFonts w:ascii="Times New Roman" w:hAnsi="Times New Roman"/>
+          <w:lang w:val="pt-BR"/>
+        </w:rPr>
+      </w:pPr>
+      <w:r>
+        <w:rPr>
+          <w:rFonts w:ascii="Times New Roman" w:hAnsi="Times New Roman"/>
+          <w:lang w:val="pt-BR"/>
+        </w:rPr>
+      </w:r>
+    </w:p>
+    <w:p>
+      <w:pPr>
+        <w:pStyle w:val="Normal"/>
+        <w:bidi w:val="0"/>
+        <w:jc w:val="start"/>
+        <w:rPr>
+          <w:rFonts w:ascii="Times New Roman" w:hAnsi="Times New Roman"/>
+          <w:lang w:val="pt-BR"/>
+        </w:rPr>
+      </w:pPr>
+      <w:r>
+        <w:rPr>
+          <w:rFonts w:ascii="Times New Roman" w:hAnsi="Times New Roman"/>
+          <w:lang w:val="pt-BR"/>
         </w:rPr>
       </w:r>
     </w:p>
@@ -2012,6 +2451,11 @@
         <w:bidi w:val="0"/>
         <w:spacing w:lineRule="auto" w:line="276"/>
         <w:jc w:val="start"/>
+        <w:rPr>
+          <w:lang w:val="pt-BR"/>
+        </w:rPr>
+      </w:pPr>
+      <w:r>
         <w:rPr>
           <w:rFonts w:ascii="Times New Roman" w:hAnsi="Times New Roman"/>
           <w:b/>
@@ -2019,16 +2463,7 @@
           <w:color w:val="2A6099"/>
           <w:sz w:val="28"/>
           <w:szCs w:val="28"/>
-        </w:rPr>
-      </w:pPr>
-      <w:r>
-        <w:rPr>
-          <w:rFonts w:ascii="Times New Roman" w:hAnsi="Times New Roman"/>
-          <w:b/>
-          <w:bCs/>
-          <w:color w:val="2A6099"/>
-          <w:sz w:val="28"/>
-          <w:szCs w:val="28"/>
+          <w:lang w:val="pt-BR"/>
         </w:rPr>
         <w:t>CURSOS E CERTIFICAÇÕES</w:t>
       </w:r>
@@ -2043,16 +2478,15 @@
         <w:bidi w:val="0"/>
         <w:jc w:val="start"/>
         <w:rPr>
-          <w:rFonts w:ascii="Times New Roman" w:hAnsi="Times New Roman"/>
-          <w:b/>
-          <w:bCs/>
-        </w:rPr>
-      </w:pPr>
-      <w:r>
-        <w:rPr>
-          <w:rFonts w:ascii="Times New Roman" w:hAnsi="Times New Roman"/>
-          <w:b/>
-          <w:bCs/>
+          <w:lang w:val="pt-BR"/>
+        </w:rPr>
+      </w:pPr>
+      <w:r>
+        <w:rPr>
+          <w:rFonts w:ascii="Times New Roman" w:hAnsi="Times New Roman"/>
+          <w:b/>
+          <w:bCs/>
+          <w:lang w:val="pt-BR"/>
         </w:rPr>
         <w:t>Trilha Full Stack (React, Next.js, Node.js e TypeScript)</w:t>
       </w:r>
@@ -2067,16 +2501,15 @@
         <w:bidi w:val="0"/>
         <w:jc w:val="start"/>
         <w:rPr>
+          <w:lang w:val="pt-BR"/>
+        </w:rPr>
+      </w:pPr>
+      <w:r>
+        <w:rPr>
           <w:rFonts w:ascii="Times New Roman" w:hAnsi="Times New Roman"/>
           <w:b w:val="false"/>
           <w:bCs w:val="false"/>
-        </w:rPr>
-      </w:pPr>
-      <w:r>
-        <w:rPr>
-          <w:rFonts w:ascii="Times New Roman" w:hAnsi="Times New Roman"/>
-          <w:b w:val="false"/>
-          <w:bCs w:val="false"/>
+          <w:lang w:val="pt-BR"/>
         </w:rPr>
         <w:t>Formação Web Completa (Node.js, SQLite, Next.js, React e TypeScript) – Origamid | 2025 – 2026</w:t>
       </w:r>
@@ -2091,16 +2524,15 @@
         <w:bidi w:val="0"/>
         <w:jc w:val="start"/>
         <w:rPr>
+          <w:lang w:val="pt-BR"/>
+        </w:rPr>
+      </w:pPr>
+      <w:r>
+        <w:rPr>
           <w:rFonts w:ascii="Times New Roman" w:hAnsi="Times New Roman"/>
           <w:b w:val="false"/>
           <w:bCs w:val="false"/>
-        </w:rPr>
-      </w:pPr>
-      <w:r>
-        <w:rPr>
-          <w:rFonts w:ascii="Times New Roman" w:hAnsi="Times New Roman"/>
-          <w:b w:val="false"/>
-          <w:bCs w:val="false"/>
+          <w:lang w:val="pt-BR"/>
         </w:rPr>
         <w:t>Especialização Next.js (App Router e Testes) – Rocketseat | 2025</w:t>
       </w:r>
@@ -2115,16 +2547,15 @@
         <w:bidi w:val="0"/>
         <w:jc w:val="start"/>
         <w:rPr>
+          <w:lang w:val="pt-BR"/>
+        </w:rPr>
+      </w:pPr>
+      <w:r>
+        <w:rPr>
           <w:rFonts w:ascii="Times New Roman" w:hAnsi="Times New Roman"/>
           <w:b w:val="false"/>
           <w:bCs w:val="false"/>
-        </w:rPr>
-      </w:pPr>
-      <w:r>
-        <w:rPr>
-          <w:rFonts w:ascii="Times New Roman" w:hAnsi="Times New Roman"/>
-          <w:b w:val="false"/>
-          <w:bCs w:val="false"/>
+          <w:lang w:val="pt-BR"/>
         </w:rPr>
         <w:t>Ecossistema Web Moderno e JS/TS Avançado – Udemy | 2025</w:t>
       </w:r>
@@ -2139,16 +2570,15 @@
         <w:bidi w:val="0"/>
         <w:jc w:val="start"/>
         <w:rPr>
-          <w:rFonts w:ascii="Times New Roman" w:hAnsi="Times New Roman"/>
-          <w:b/>
-          <w:bCs/>
-        </w:rPr>
-      </w:pPr>
-      <w:r>
-        <w:rPr>
-          <w:rFonts w:ascii="Times New Roman" w:hAnsi="Times New Roman"/>
-          <w:b/>
-          <w:bCs/>
+          <w:lang w:val="pt-BR"/>
+        </w:rPr>
+      </w:pPr>
+      <w:r>
+        <w:rPr>
+          <w:rFonts w:ascii="Times New Roman" w:hAnsi="Times New Roman"/>
+          <w:b/>
+          <w:bCs/>
+          <w:lang w:val="pt-BR"/>
         </w:rPr>
         <w:t>Qualidade, UI/UX e Ferramentas</w:t>
       </w:r>
@@ -2163,16 +2593,15 @@
         <w:bidi w:val="0"/>
         <w:jc w:val="start"/>
         <w:rPr>
+          <w:lang w:val="pt-BR"/>
+        </w:rPr>
+      </w:pPr>
+      <w:r>
+        <w:rPr>
           <w:rFonts w:ascii="Times New Roman" w:hAnsi="Times New Roman"/>
           <w:b w:val="false"/>
           <w:bCs w:val="false"/>
-        </w:rPr>
-      </w:pPr>
-      <w:r>
-        <w:rPr>
-          <w:rFonts w:ascii="Times New Roman" w:hAnsi="Times New Roman"/>
-          <w:b w:val="false"/>
-          <w:bCs w:val="false"/>
+          <w:lang w:val="pt-BR"/>
         </w:rPr>
         <w:t>Treinamento em Controle de Qualidade TQC – QaCoders Academy | 2025</w:t>
       </w:r>
@@ -2187,16 +2616,15 @@
         <w:bidi w:val="0"/>
         <w:jc w:val="start"/>
         <w:rPr>
+          <w:lang w:val="pt-BR"/>
+        </w:rPr>
+      </w:pPr>
+      <w:r>
+        <w:rPr>
           <w:rFonts w:ascii="Times New Roman" w:hAnsi="Times New Roman"/>
           <w:b w:val="false"/>
           <w:bCs w:val="false"/>
-        </w:rPr>
-      </w:pPr>
-      <w:r>
-        <w:rPr>
-          <w:rFonts w:ascii="Times New Roman" w:hAnsi="Times New Roman"/>
-          <w:b w:val="false"/>
-          <w:bCs w:val="false"/>
+          <w:lang w:val="pt-BR"/>
         </w:rPr>
         <w:t>Formação UX Design &amp; UI Design Avançado – Alura e Origamid | 2025</w:t>
       </w:r>
@@ -2208,41 +2636,47 @@
         <w:jc w:val="start"/>
         <w:rPr>
           <w:rFonts w:ascii="Times New Roman" w:hAnsi="Times New Roman"/>
-        </w:rPr>
-      </w:pPr>
-      <w:r>
-        <w:rPr>
-          <w:rFonts w:ascii="Times New Roman" w:hAnsi="Times New Roman"/>
-        </w:rPr>
-      </w:r>
-    </w:p>
-    <w:p>
-      <w:pPr>
-        <w:pStyle w:val="Normal"/>
-        <w:bidi w:val="0"/>
-        <w:jc w:val="start"/>
-        <w:rPr>
-          <w:rFonts w:ascii="Times New Roman" w:hAnsi="Times New Roman"/>
-        </w:rPr>
-      </w:pPr>
-      <w:r>
-        <w:rPr>
-          <w:rFonts w:ascii="Times New Roman" w:hAnsi="Times New Roman"/>
-        </w:rPr>
-      </w:r>
-    </w:p>
-    <w:p>
-      <w:pPr>
-        <w:pStyle w:val="Normal"/>
-        <w:bidi w:val="0"/>
-        <w:jc w:val="start"/>
-        <w:rPr>
-          <w:rFonts w:ascii="Times New Roman" w:hAnsi="Times New Roman"/>
-        </w:rPr>
-      </w:pPr>
-      <w:r>
-        <w:rPr>
-          <w:rFonts w:ascii="Times New Roman" w:hAnsi="Times New Roman"/>
+          <w:lang w:val="pt-BR"/>
+        </w:rPr>
+      </w:pPr>
+      <w:r>
+        <w:rPr>
+          <w:rFonts w:ascii="Times New Roman" w:hAnsi="Times New Roman"/>
+          <w:lang w:val="pt-BR"/>
+        </w:rPr>
+      </w:r>
+    </w:p>
+    <w:p>
+      <w:pPr>
+        <w:pStyle w:val="Normal"/>
+        <w:bidi w:val="0"/>
+        <w:jc w:val="start"/>
+        <w:rPr>
+          <w:rFonts w:ascii="Times New Roman" w:hAnsi="Times New Roman"/>
+          <w:lang w:val="pt-BR"/>
+        </w:rPr>
+      </w:pPr>
+      <w:r>
+        <w:rPr>
+          <w:rFonts w:ascii="Times New Roman" w:hAnsi="Times New Roman"/>
+          <w:lang w:val="pt-BR"/>
+        </w:rPr>
+      </w:r>
+    </w:p>
+    <w:p>
+      <w:pPr>
+        <w:pStyle w:val="Normal"/>
+        <w:bidi w:val="0"/>
+        <w:jc w:val="start"/>
+        <w:rPr>
+          <w:rFonts w:ascii="Times New Roman" w:hAnsi="Times New Roman"/>
+          <w:lang w:val="pt-BR"/>
+        </w:rPr>
+      </w:pPr>
+      <w:r>
+        <w:rPr>
+          <w:rFonts w:ascii="Times New Roman" w:hAnsi="Times New Roman"/>
+          <w:lang w:val="pt-BR"/>
         </w:rPr>
       </w:r>
     </w:p>
@@ -2252,6 +2686,11 @@
         <w:bidi w:val="0"/>
         <w:spacing w:lineRule="auto" w:line="276"/>
         <w:jc w:val="start"/>
+        <w:rPr>
+          <w:lang w:val="pt-BR"/>
+        </w:rPr>
+      </w:pPr>
+      <w:r>
         <w:rPr>
           <w:rFonts w:ascii="Times New Roman" w:hAnsi="Times New Roman"/>
           <w:b/>
@@ -2259,16 +2698,7 @@
           <w:color w:val="2A6099"/>
           <w:sz w:val="28"/>
           <w:szCs w:val="28"/>
-        </w:rPr>
-      </w:pPr>
-      <w:r>
-        <w:rPr>
-          <w:rFonts w:ascii="Times New Roman" w:hAnsi="Times New Roman"/>
-          <w:b/>
-          <w:bCs/>
-          <w:color w:val="2A6099"/>
-          <w:sz w:val="28"/>
-          <w:szCs w:val="28"/>
+          <w:lang w:val="pt-BR"/>
         </w:rPr>
         <w:t>INFORMAÇÕES ADICIONAIS</w:t>
       </w:r>
@@ -2279,12 +2709,13 @@
         <w:bidi w:val="0"/>
         <w:jc w:val="start"/>
         <w:rPr>
-          <w:rFonts w:ascii="Times New Roman" w:hAnsi="Times New Roman"/>
-        </w:rPr>
-      </w:pPr>
-      <w:r>
-        <w:rPr>
-          <w:rFonts w:ascii="Times New Roman" w:hAnsi="Times New Roman"/>
+          <w:lang w:val="pt-BR"/>
+        </w:rPr>
+      </w:pPr>
+      <w:r>
+        <w:rPr>
+          <w:rFonts w:ascii="Times New Roman" w:hAnsi="Times New Roman"/>
+          <w:lang w:val="pt-BR"/>
         </w:rPr>
         <w:tab/>
         <w:t>Disponibilidade para trabalho presencial/remoto/híbrido</w:t>
@@ -2309,7 +2740,6 @@
     <w:lvl w:ilvl="0">
       <w:start w:val="1"/>
       <w:numFmt w:val="none"/>
-      <w:pStyle w:val="Heading1"/>
       <w:suff w:val="nothing"/>
       <w:lvlText w:val="%1"/>
       <w:lvlJc w:val="start"/>
@@ -2428,138 +2858,129 @@
   <w:abstractNum w:abstractNumId="2">
     <w:lvl w:ilvl="0">
       <w:start w:val="1"/>
-      <w:numFmt w:val="bullet"/>
-      <w:lvlText w:val=""/>
-      <w:lvlJc w:val="start"/>
-      <w:pPr>
-        <w:tabs>
-          <w:tab w:val="num" w:pos="720"/>
-        </w:tabs>
-        <w:ind w:start="720" w:hanging="360"/>
-      </w:pPr>
-      <w:rPr>
-        <w:rFonts w:ascii="Symbol" w:hAnsi="Symbol" w:cs="Symbol" w:hint="default"/>
-      </w:rPr>
+      <w:numFmt w:val="none"/>
+      <w:suff w:val="nothing"/>
+      <w:lvlText w:val="%1"/>
+      <w:lvlJc w:val="start"/>
+      <w:pPr>
+        <w:tabs>
+          <w:tab w:val="num" w:pos="0"/>
+        </w:tabs>
+        <w:ind w:start="0" w:hanging="0"/>
+      </w:pPr>
+      <w:rPr/>
     </w:lvl>
     <w:lvl w:ilvl="1">
       <w:start w:val="1"/>
-      <w:numFmt w:val="bullet"/>
-      <w:lvlText w:val="◦"/>
-      <w:lvlJc w:val="start"/>
-      <w:pPr>
-        <w:tabs>
-          <w:tab w:val="num" w:pos="1080"/>
-        </w:tabs>
-        <w:ind w:start="1080" w:hanging="360"/>
-      </w:pPr>
-      <w:rPr>
-        <w:rFonts w:ascii="OpenSymbol" w:hAnsi="OpenSymbol" w:cs="OpenSymbol" w:hint="default"/>
-      </w:rPr>
+      <w:numFmt w:val="none"/>
+      <w:suff w:val="nothing"/>
+      <w:lvlText w:val="%2"/>
+      <w:lvlJc w:val="start"/>
+      <w:pPr>
+        <w:tabs>
+          <w:tab w:val="num" w:pos="0"/>
+        </w:tabs>
+        <w:ind w:start="0" w:hanging="0"/>
+      </w:pPr>
+      <w:rPr/>
     </w:lvl>
     <w:lvl w:ilvl="2">
       <w:start w:val="1"/>
-      <w:numFmt w:val="bullet"/>
-      <w:lvlText w:val="▪"/>
-      <w:lvlJc w:val="start"/>
-      <w:pPr>
-        <w:tabs>
-          <w:tab w:val="num" w:pos="1440"/>
-        </w:tabs>
-        <w:ind w:start="1440" w:hanging="360"/>
-      </w:pPr>
-      <w:rPr>
-        <w:rFonts w:ascii="OpenSymbol" w:hAnsi="OpenSymbol" w:cs="OpenSymbol" w:hint="default"/>
-      </w:rPr>
+      <w:numFmt w:val="none"/>
+      <w:suff w:val="nothing"/>
+      <w:lvlText w:val="%3"/>
+      <w:lvlJc w:val="start"/>
+      <w:pPr>
+        <w:tabs>
+          <w:tab w:val="num" w:pos="0"/>
+        </w:tabs>
+        <w:ind w:start="0" w:hanging="0"/>
+      </w:pPr>
+      <w:rPr/>
     </w:lvl>
     <w:lvl w:ilvl="3">
       <w:start w:val="1"/>
-      <w:numFmt w:val="bullet"/>
-      <w:lvlText w:val=""/>
-      <w:lvlJc w:val="start"/>
-      <w:pPr>
-        <w:tabs>
-          <w:tab w:val="num" w:pos="1800"/>
-        </w:tabs>
-        <w:ind w:start="1800" w:hanging="360"/>
-      </w:pPr>
-      <w:rPr>
-        <w:rFonts w:ascii="Symbol" w:hAnsi="Symbol" w:cs="Symbol" w:hint="default"/>
-      </w:rPr>
+      <w:numFmt w:val="none"/>
+      <w:suff w:val="nothing"/>
+      <w:lvlText w:val="%4"/>
+      <w:lvlJc w:val="start"/>
+      <w:pPr>
+        <w:tabs>
+          <w:tab w:val="num" w:pos="0"/>
+        </w:tabs>
+        <w:ind w:start="0" w:hanging="0"/>
+      </w:pPr>
+      <w:rPr/>
     </w:lvl>
     <w:lvl w:ilvl="4">
       <w:start w:val="1"/>
-      <w:numFmt w:val="bullet"/>
-      <w:lvlText w:val="◦"/>
-      <w:lvlJc w:val="start"/>
-      <w:pPr>
-        <w:tabs>
-          <w:tab w:val="num" w:pos="2160"/>
-        </w:tabs>
-        <w:ind w:start="2160" w:hanging="360"/>
-      </w:pPr>
-      <w:rPr>
-        <w:rFonts w:ascii="OpenSymbol" w:hAnsi="OpenSymbol" w:cs="OpenSymbol" w:hint="default"/>
-      </w:rPr>
+      <w:numFmt w:val="none"/>
+      <w:suff w:val="nothing"/>
+      <w:lvlText w:val="%5"/>
+      <w:lvlJc w:val="start"/>
+      <w:pPr>
+        <w:tabs>
+          <w:tab w:val="num" w:pos="0"/>
+        </w:tabs>
+        <w:ind w:start="0" w:hanging="0"/>
+      </w:pPr>
+      <w:rPr/>
     </w:lvl>
     <w:lvl w:ilvl="5">
       <w:start w:val="1"/>
-      <w:numFmt w:val="bullet"/>
-      <w:lvlText w:val="▪"/>
-      <w:lvlJc w:val="start"/>
-      <w:pPr>
-        <w:tabs>
-          <w:tab w:val="num" w:pos="2520"/>
-        </w:tabs>
-        <w:ind w:start="2520" w:hanging="360"/>
-      </w:pPr>
-      <w:rPr>
-        <w:rFonts w:ascii="OpenSymbol" w:hAnsi="OpenSymbol" w:cs="OpenSymbol" w:hint="default"/>
-      </w:rPr>
+      <w:numFmt w:val="none"/>
+      <w:suff w:val="nothing"/>
+      <w:lvlText w:val="%6"/>
+      <w:lvlJc w:val="start"/>
+      <w:pPr>
+        <w:tabs>
+          <w:tab w:val="num" w:pos="0"/>
+        </w:tabs>
+        <w:ind w:start="0" w:hanging="0"/>
+      </w:pPr>
+      <w:rPr/>
     </w:lvl>
     <w:lvl w:ilvl="6">
       <w:start w:val="1"/>
-      <w:numFmt w:val="bullet"/>
-      <w:lvlText w:val=""/>
-      <w:lvlJc w:val="start"/>
-      <w:pPr>
-        <w:tabs>
-          <w:tab w:val="num" w:pos="2880"/>
-        </w:tabs>
-        <w:ind w:start="2880" w:hanging="360"/>
-      </w:pPr>
-      <w:rPr>
-        <w:rFonts w:ascii="Symbol" w:hAnsi="Symbol" w:cs="Symbol" w:hint="default"/>
-      </w:rPr>
+      <w:numFmt w:val="none"/>
+      <w:suff w:val="nothing"/>
+      <w:lvlText w:val="%7"/>
+      <w:lvlJc w:val="start"/>
+      <w:pPr>
+        <w:tabs>
+          <w:tab w:val="num" w:pos="0"/>
+        </w:tabs>
+        <w:ind w:start="0" w:hanging="0"/>
+      </w:pPr>
+      <w:rPr/>
     </w:lvl>
     <w:lvl w:ilvl="7">
       <w:start w:val="1"/>
-      <w:numFmt w:val="bullet"/>
-      <w:lvlText w:val="◦"/>
-      <w:lvlJc w:val="start"/>
-      <w:pPr>
-        <w:tabs>
-          <w:tab w:val="num" w:pos="3240"/>
-        </w:tabs>
-        <w:ind w:start="3240" w:hanging="360"/>
-      </w:pPr>
-      <w:rPr>
-        <w:rFonts w:ascii="OpenSymbol" w:hAnsi="OpenSymbol" w:cs="OpenSymbol" w:hint="default"/>
-      </w:rPr>
+      <w:numFmt w:val="none"/>
+      <w:suff w:val="nothing"/>
+      <w:lvlText w:val="%8"/>
+      <w:lvlJc w:val="start"/>
+      <w:pPr>
+        <w:tabs>
+          <w:tab w:val="num" w:pos="0"/>
+        </w:tabs>
+        <w:ind w:start="0" w:hanging="0"/>
+      </w:pPr>
+      <w:rPr/>
     </w:lvl>
     <w:lvl w:ilvl="8">
       <w:start w:val="1"/>
-      <w:numFmt w:val="bullet"/>
-      <w:lvlText w:val="▪"/>
-      <w:lvlJc w:val="start"/>
-      <w:pPr>
-        <w:tabs>
-          <w:tab w:val="num" w:pos="3600"/>
-        </w:tabs>
-        <w:ind w:start="3600" w:hanging="360"/>
-      </w:pPr>
-      <w:rPr>
-        <w:rFonts w:ascii="OpenSymbol" w:hAnsi="OpenSymbol" w:cs="OpenSymbol" w:hint="default"/>
-      </w:rPr>
+      <w:numFmt w:val="none"/>
+      <w:suff w:val="nothing"/>
+      <w:lvlText w:val="%9"/>
+      <w:lvlJc w:val="start"/>
+      <w:pPr>
+        <w:tabs>
+          <w:tab w:val="num" w:pos="0"/>
+        </w:tabs>
+        <w:ind w:start="0" w:hanging="0"/>
+      </w:pPr>
+      <w:rPr/>
     </w:lvl>
   </w:abstractNum>
   <w:abstractNum w:abstractNumId="3">
@@ -4405,7 +4826,6 @@
     </w:rPrDefault>
     <w:pPrDefault>
       <w:pPr>
-        <w:widowControl/>
         <w:suppressAutoHyphens w:val="true"/>
       </w:pPr>
     </w:pPrDefault>
@@ -4415,10 +4835,13 @@
     <w:qFormat/>
     <w:pPr>
       <w:widowControl/>
+      <w:suppressAutoHyphens w:val="true"/>
       <w:kinsoku w:val="true"/>
-      <w:overflowPunct w:val="true"/>
+      <w:overflowPunct w:val="false"/>
       <w:autoSpaceDE w:val="true"/>
       <w:bidi w:val="0"/>
+      <w:spacing w:before="0" w:after="0"/>
+      <w:jc w:val="start"/>
     </w:pPr>
     <w:rPr>
       <w:rFonts w:ascii="Liberation Serif" w:hAnsi="Liberation Serif" w:eastAsia="Noto Serif CJK SC" w:cs="Noto Sans Devanagari"/>
@@ -4437,7 +4860,7 @@
     <w:pPr>
       <w:numPr>
         <w:ilvl w:val="0"/>
-        <w:numId w:val="1"/>
+        <w:numId w:val="2"/>
       </w:numPr>
       <w:spacing w:before="240" w:after="120"/>
       <w:outlineLvl w:val="0"/>
@@ -4456,8 +4879,8 @@
       <w:u w:val="single"/>
     </w:rPr>
   </w:style>
-  <w:style w:type="character" w:styleId="Bullets">
-    <w:name w:val="Bullets"/>
+  <w:style w:type="character" w:styleId="Bulletsuser">
+    <w:name w:val="Bullets (user)"/>
     <w:qFormat/>
     <w:rPr>
       <w:rFonts w:ascii="OpenSymbol" w:hAnsi="OpenSymbol" w:eastAsia="OpenSymbol" w:cs="OpenSymbol"/>

</xml_diff>